<commit_message>
feat(minciencias-2024): catalogo maestro oficial 2024 (5 familias GNC/DTI/ASC/DPC/FRH), calculo IPP y documentacion formal
</commit_message>
<xml_diff>
--- a/Documentacion_Tecnica_GrupoXX.docx
+++ b/Documentacion_Tecnica_GrupoXX.docx
@@ -3722,8 +3722,6 @@
     <w:tbl>
       <w:tblPr>
         <w:tblW w:type="auto" w:w="0"/>
-        <w:jc w:val="center"/>
-        <w:tblLayout w:type="fixed"/>
         <w:tblLook w:firstColumn="1" w:firstRow="1" w:lastColumn="0" w:lastRow="0" w:noHBand="0" w:noVBand="1" w:val="04A0"/>
       </w:tblPr>
       <w:tblGrid>
@@ -3734,7 +3732,54 @@
       <w:tr>
         <w:tc>
           <w:tcPr>
-            <w:tcW w:type="dxa" w:w="2304"/>
+            <w:tcW w:type="dxa" w:w="3120"/>
+          </w:tcPr>
+          <w:p/>
+        </w:tc>
+        <w:tc>
+          <w:tcPr>
+            <w:tcW w:type="dxa" w:w="3120"/>
+          </w:tcPr>
+          <w:p/>
+        </w:tc>
+        <w:tc>
+          <w:tcPr>
+            <w:tcW w:type="dxa" w:w="3120"/>
+          </w:tcPr>
+          <w:p/>
+        </w:tc>
+      </w:tr>
+    </w:tbl>
+    <w:p>
+      <w:pPr>
+        <w:pStyle w:val="Heading2"/>
+      </w:pPr>
+      <w:r>
+        <w:t>3.3 Taxonomía Oficial y Matriz de Ponderación MinCiencias 2024 (Convocatoria 957)</w:t>
+      </w:r>
+    </w:p>
+    <w:p>
+      <w:r>
+        <w:t>Frente a modelos obsoletos (pre-2022) que utilizaban listas planas de productos sin ponderación, el sistema PEA-i implementa la taxonomía oficial de la Convocatoria Nacional 957 de 2024 (Anexo 1 del Modelo MinCiencias), estructurada en 5 Familias Oficiales, clases de medición jerárquicas y pesos para el cálculo del Índice de Producción Ponderada (IPP):</w:t>
+      </w:r>
+    </w:p>
+    <w:tbl>
+      <w:tblPr>
+        <w:tblW w:type="auto" w:w="0"/>
+        <w:jc w:val="center"/>
+        <w:tblLayout w:type="fixed"/>
+        <w:tblLook w:firstColumn="1" w:firstRow="1" w:lastColumn="0" w:lastRow="0" w:noHBand="0" w:noVBand="1" w:val="04A0"/>
+      </w:tblPr>
+      <w:tblGrid>
+        <w:gridCol w:w="2340"/>
+        <w:gridCol w:w="2340"/>
+        <w:gridCol w:w="2340"/>
+        <w:gridCol w:w="2340"/>
+      </w:tblGrid>
+      <w:tr>
+        <w:tc>
+          <w:tcPr>
+            <w:tcW w:type="dxa" w:w="1728"/>
             <w:shd w:fill="006837"/>
             <w:tcMar>
               <w:top w:w="120" w:type="dxa"/>
@@ -3755,13 +3800,13 @@
                 <w:color w:val="FFFFFF"/>
                 <w:sz w:val="18"/>
               </w:rPr>
-              <w:t>TDA Académico</w:t>
+              <w:t>Familia 2024</w:t>
             </w:r>
           </w:p>
         </w:tc>
         <w:tc>
           <w:tcPr>
-            <w:tcW w:type="dxa" w:w="2016"/>
+            <w:tcW w:type="dxa" w:w="3168"/>
             <w:shd w:fill="006837"/>
             <w:tcMar>
               <w:top w:w="120" w:type="dxa"/>
@@ -3782,13 +3827,13 @@
                 <w:color w:val="FFFFFF"/>
                 <w:sz w:val="18"/>
               </w:rPr>
-              <w:t>Principio Operativo</w:t>
+              <w:t>Nombre Oficial</w:t>
             </w:r>
           </w:p>
         </w:tc>
         <w:tc>
           <w:tcPr>
-            <w:tcW w:type="dxa" w:w="5040"/>
+            <w:tcW w:type="dxa" w:w="3312"/>
             <w:shd w:fill="006837"/>
             <w:tcMar>
               <w:top w:w="120" w:type="dxa"/>
@@ -3809,7 +3854,34 @@
                 <w:color w:val="FFFFFF"/>
                 <w:sz w:val="18"/>
               </w:rPr>
-              <w:t>Uso y Justificación en el Sistema PEA-i</w:t>
+              <w:t>Tipologías Representativas</w:t>
+            </w:r>
+          </w:p>
+        </w:tc>
+        <w:tc>
+          <w:tcPr>
+            <w:tcW w:type="dxa" w:w="1152"/>
+            <w:shd w:fill="006837"/>
+            <w:tcMar>
+              <w:top w:w="120" w:type="dxa"/>
+              <w:bottom w:w="120" w:type="dxa"/>
+              <w:left w:w="120" w:type="dxa"/>
+              <w:right w:w="120" w:type="dxa"/>
+            </w:tcMar>
+          </w:tcPr>
+          <w:p>
+            <w:pPr>
+              <w:spacing w:before="0" w:after="0"/>
+              <w:jc w:val="center"/>
+            </w:pPr>
+            <w:r>
+              <w:rPr>
+                <w:rFonts w:ascii="Segoe UI" w:hAnsi="Segoe UI"/>
+                <w:b/>
+                <w:color w:val="FFFFFF"/>
+                <w:sz w:val="18"/>
+              </w:rPr>
+              <w:t>Peso Global (pts)</w:t>
             </w:r>
           </w:p>
         </w:tc>
@@ -3817,7 +3889,7 @@
       <w:tr>
         <w:tc>
           <w:tcPr>
-            <w:tcW w:type="dxa" w:w="2304"/>
+            <w:tcW w:type="dxa" w:w="1728"/>
             <w:shd w:fill="FFFFFF"/>
             <w:tcMar>
               <w:top w:w="80" w:type="dxa"/>
@@ -3836,13 +3908,13 @@
                 <w:color w:val="1A202C"/>
                 <w:sz w:val="17"/>
               </w:rPr>
-              <w:t>Multilista Ortogonal 3D</w:t>
+              <w:t>GNC</w:t>
             </w:r>
           </w:p>
         </w:tc>
         <w:tc>
           <w:tcPr>
-            <w:tcW w:type="dxa" w:w="2016"/>
+            <w:tcW w:type="dxa" w:w="3168"/>
             <w:shd w:fill="FFFFFF"/>
             <w:tcMar>
               <w:top w:w="80" w:type="dxa"/>
@@ -3861,13 +3933,13 @@
                 <w:color w:val="1A202C"/>
                 <w:sz w:val="17"/>
               </w:rPr>
-              <w:t>Punteros ortogonales cruzados</w:t>
+              <w:t>Generación de Nuevo Conocimiento</w:t>
             </w:r>
           </w:p>
         </w:tc>
         <w:tc>
           <w:tcPr>
-            <w:tcW w:type="dxa" w:w="5040"/>
+            <w:tcW w:type="dxa" w:w="3312"/>
             <w:shd w:fill="FFFFFF"/>
             <w:tcMar>
               <w:top w:w="80" w:type="dxa"/>
@@ -3886,7 +3958,32 @@
                 <w:color w:val="1A202C"/>
                 <w:sz w:val="17"/>
               </w:rPr>
-              <w:t>Modela el Hipercubo tridimensional. Vincula cada producto al grupo y al autor simultáneamente en tiempo constante sin duplicación.</w:t>
+              <w:t>Artículos indexados A1-C (Q1-Q4), Libros de investigación, Capítulos y Patentes.</w:t>
+            </w:r>
+          </w:p>
+        </w:tc>
+        <w:tc>
+          <w:tcPr>
+            <w:tcW w:type="dxa" w:w="1152"/>
+            <w:shd w:fill="FFFFFF"/>
+            <w:tcMar>
+              <w:top w:w="80" w:type="dxa"/>
+              <w:bottom w:w="80" w:type="dxa"/>
+              <w:left w:w="100" w:type="dxa"/>
+              <w:right w:w="100" w:type="dxa"/>
+            </w:tcMar>
+          </w:tcPr>
+          <w:p>
+            <w:pPr>
+              <w:spacing w:before="0" w:after="0"/>
+            </w:pPr>
+            <w:r>
+              <w:rPr>
+                <w:rFonts w:ascii="Segoe UI" w:hAnsi="Segoe UI"/>
+                <w:color w:val="1A202C"/>
+                <w:sz w:val="17"/>
+              </w:rPr>
+              <w:t>40 - 100</w:t>
             </w:r>
           </w:p>
         </w:tc>
@@ -3894,7 +3991,7 @@
       <w:tr>
         <w:tc>
           <w:tcPr>
-            <w:tcW w:type="dxa" w:w="2304"/>
+            <w:tcW w:type="dxa" w:w="1728"/>
             <w:shd w:fill="F8F9FA"/>
             <w:tcMar>
               <w:top w:w="80" w:type="dxa"/>
@@ -3913,13 +4010,13 @@
                 <w:color w:val="1A202C"/>
                 <w:sz w:val="17"/>
               </w:rPr>
-              <w:t>Lista Enlazada Simple</w:t>
+              <w:t>DTI</w:t>
             </w:r>
           </w:p>
         </w:tc>
         <w:tc>
           <w:tcPr>
-            <w:tcW w:type="dxa" w:w="2016"/>
+            <w:tcW w:type="dxa" w:w="3168"/>
             <w:shd w:fill="F8F9FA"/>
             <w:tcMar>
               <w:top w:w="80" w:type="dxa"/>
@@ -3938,13 +4035,13 @@
                 <w:color w:val="1A202C"/>
                 <w:sz w:val="17"/>
               </w:rPr>
-              <w:t>Puntero sigNodo lineal</w:t>
+              <w:t>Desarrollo Tecnológico e Innovación</w:t>
             </w:r>
           </w:p>
         </w:tc>
         <w:tc>
           <w:tcPr>
-            <w:tcW w:type="dxa" w:w="5040"/>
+            <w:tcW w:type="dxa" w:w="3312"/>
             <w:shd w:fill="F8F9FA"/>
             <w:tcMar>
               <w:top w:w="80" w:type="dxa"/>
@@ -3963,7 +4060,32 @@
                 <w:color w:val="1A202C"/>
                 <w:sz w:val="17"/>
               </w:rPr>
-              <w:t>Gestiona la secuencia de grupos institucionales y catálogos globales de categorías en memoria dinámica.</w:t>
+              <w:t>Software con soporte lógico ante DNDA, Prototipos industriales, Diseños y Regulaciones.</w:t>
+            </w:r>
+          </w:p>
+        </w:tc>
+        <w:tc>
+          <w:tcPr>
+            <w:tcW w:type="dxa" w:w="1152"/>
+            <w:shd w:fill="F8F9FA"/>
+            <w:tcMar>
+              <w:top w:w="80" w:type="dxa"/>
+              <w:bottom w:w="80" w:type="dxa"/>
+              <w:left w:w="100" w:type="dxa"/>
+              <w:right w:w="100" w:type="dxa"/>
+            </w:tcMar>
+          </w:tcPr>
+          <w:p>
+            <w:pPr>
+              <w:spacing w:before="0" w:after="0"/>
+            </w:pPr>
+            <w:r>
+              <w:rPr>
+                <w:rFonts w:ascii="Segoe UI" w:hAnsi="Segoe UI"/>
+                <w:color w:val="1A202C"/>
+                <w:sz w:val="17"/>
+              </w:rPr>
+              <w:t>60 - 90</w:t>
             </w:r>
           </w:p>
         </w:tc>
@@ -3971,7 +4093,7 @@
       <w:tr>
         <w:tc>
           <w:tcPr>
-            <w:tcW w:type="dxa" w:w="2304"/>
+            <w:tcW w:type="dxa" w:w="1728"/>
             <w:shd w:fill="FFFFFF"/>
             <w:tcMar>
               <w:top w:w="80" w:type="dxa"/>
@@ -3990,13 +4112,13 @@
                 <w:color w:val="1A202C"/>
                 <w:sz w:val="17"/>
               </w:rPr>
-              <w:t>Pila (Stack)</w:t>
+              <w:t>ASC</w:t>
             </w:r>
           </w:p>
         </w:tc>
         <w:tc>
           <w:tcPr>
-            <w:tcW w:type="dxa" w:w="2016"/>
+            <w:tcW w:type="dxa" w:w="3168"/>
             <w:shd w:fill="FFFFFF"/>
             <w:tcMar>
               <w:top w:w="80" w:type="dxa"/>
@@ -4015,13 +4137,13 @@
                 <w:color w:val="1A202C"/>
                 <w:sz w:val="17"/>
               </w:rPr>
-              <w:t>LIFO (Last-In, First-Out)</w:t>
+              <w:t>Apropiación Social del Conocimiento</w:t>
             </w:r>
           </w:p>
         </w:tc>
         <w:tc>
           <w:tcPr>
-            <w:tcW w:type="dxa" w:w="5040"/>
+            <w:tcW w:type="dxa" w:w="3312"/>
             <w:shd w:fill="FFFFFF"/>
             <w:tcMar>
               <w:top w:w="80" w:type="dxa"/>
@@ -4040,7 +4162,32 @@
                 <w:color w:val="1A202C"/>
                 <w:sz w:val="17"/>
               </w:rPr>
-              <w:t>Módulo Deshacer (Undo). Cada inserción, edición o borrado hace push(). Al presionar Undo se hace pop() revirtiendo el estado en O(1).</w:t>
+              <w:t>Procesos participativos de CTeI con comunidades y Proyectos de innovación social territorial.</w:t>
+            </w:r>
+          </w:p>
+        </w:tc>
+        <w:tc>
+          <w:tcPr>
+            <w:tcW w:type="dxa" w:w="1152"/>
+            <w:shd w:fill="FFFFFF"/>
+            <w:tcMar>
+              <w:top w:w="80" w:type="dxa"/>
+              <w:bottom w:w="80" w:type="dxa"/>
+              <w:left w:w="100" w:type="dxa"/>
+              <w:right w:w="100" w:type="dxa"/>
+            </w:tcMar>
+          </w:tcPr>
+          <w:p>
+            <w:pPr>
+              <w:spacing w:before="0" w:after="0"/>
+            </w:pPr>
+            <w:r>
+              <w:rPr>
+                <w:rFonts w:ascii="Segoe UI" w:hAnsi="Segoe UI"/>
+                <w:color w:val="1A202C"/>
+                <w:sz w:val="17"/>
+              </w:rPr>
+              <w:t>50 - 90</w:t>
             </w:r>
           </w:p>
         </w:tc>
@@ -4048,7 +4195,7 @@
       <w:tr>
         <w:tc>
           <w:tcPr>
-            <w:tcW w:type="dxa" w:w="2304"/>
+            <w:tcW w:type="dxa" w:w="1728"/>
             <w:shd w:fill="F8F9FA"/>
             <w:tcMar>
               <w:top w:w="80" w:type="dxa"/>
@@ -4067,13 +4214,13 @@
                 <w:color w:val="1A202C"/>
                 <w:sz w:val="17"/>
               </w:rPr>
-              <w:t>Cola (Queue)</w:t>
+              <w:t>DPC</w:t>
             </w:r>
           </w:p>
         </w:tc>
         <w:tc>
           <w:tcPr>
-            <w:tcW w:type="dxa" w:w="2016"/>
+            <w:tcW w:type="dxa" w:w="3168"/>
             <w:shd w:fill="F8F9FA"/>
             <w:tcMar>
               <w:top w:w="80" w:type="dxa"/>
@@ -4092,13 +4239,13 @@
                 <w:color w:val="1A202C"/>
                 <w:sz w:val="17"/>
               </w:rPr>
-              <w:t>FIFO (First-In, First-Out)</w:t>
+              <w:t>Divulgación Pública de la Ciencia</w:t>
             </w:r>
           </w:p>
         </w:tc>
         <w:tc>
           <w:tcPr>
-            <w:tcW w:type="dxa" w:w="5040"/>
+            <w:tcW w:type="dxa" w:w="3312"/>
             <w:shd w:fill="F8F9FA"/>
             <w:tcMar>
               <w:top w:w="80" w:type="dxa"/>
@@ -4117,7 +4264,134 @@
                 <w:color w:val="1A202C"/>
                 <w:sz w:val="17"/>
               </w:rPr>
-              <w:t>Ingesta masiva por lotes. Encola tareas de scraping GrupLAC/CvLAC, parseo de PDF y CSV, procesándolas en orden estricto de llegada.</w:t>
+              <w:t>Ponencias en eventos científicos nacionales/internacionales, Talleres y Documentos de trabajo.</w:t>
+            </w:r>
+          </w:p>
+        </w:tc>
+        <w:tc>
+          <w:tcPr>
+            <w:tcW w:type="dxa" w:w="1152"/>
+            <w:shd w:fill="F8F9FA"/>
+            <w:tcMar>
+              <w:top w:w="80" w:type="dxa"/>
+              <w:bottom w:w="80" w:type="dxa"/>
+              <w:left w:w="100" w:type="dxa"/>
+              <w:right w:w="100" w:type="dxa"/>
+            </w:tcMar>
+          </w:tcPr>
+          <w:p>
+            <w:pPr>
+              <w:spacing w:before="0" w:after="0"/>
+            </w:pPr>
+            <w:r>
+              <w:rPr>
+                <w:rFonts w:ascii="Segoe UI" w:hAnsi="Segoe UI"/>
+                <w:color w:val="1A202C"/>
+                <w:sz w:val="17"/>
+              </w:rPr>
+              <w:t>30 - 60</w:t>
+            </w:r>
+          </w:p>
+        </w:tc>
+      </w:tr>
+      <w:tr>
+        <w:tc>
+          <w:tcPr>
+            <w:tcW w:type="dxa" w:w="1728"/>
+            <w:shd w:fill="FFFFFF"/>
+            <w:tcMar>
+              <w:top w:w="80" w:type="dxa"/>
+              <w:bottom w:w="80" w:type="dxa"/>
+              <w:left w:w="100" w:type="dxa"/>
+              <w:right w:w="100" w:type="dxa"/>
+            </w:tcMar>
+          </w:tcPr>
+          <w:p>
+            <w:pPr>
+              <w:spacing w:before="0" w:after="0"/>
+            </w:pPr>
+            <w:r>
+              <w:rPr>
+                <w:rFonts w:ascii="Segoe UI" w:hAnsi="Segoe UI"/>
+                <w:color w:val="1A202C"/>
+                <w:sz w:val="17"/>
+              </w:rPr>
+              <w:t>FRH</w:t>
+            </w:r>
+          </w:p>
+        </w:tc>
+        <w:tc>
+          <w:tcPr>
+            <w:tcW w:type="dxa" w:w="3168"/>
+            <w:shd w:fill="FFFFFF"/>
+            <w:tcMar>
+              <w:top w:w="80" w:type="dxa"/>
+              <w:bottom w:w="80" w:type="dxa"/>
+              <w:left w:w="100" w:type="dxa"/>
+              <w:right w:w="100" w:type="dxa"/>
+            </w:tcMar>
+          </w:tcPr>
+          <w:p>
+            <w:pPr>
+              <w:spacing w:before="0" w:after="0"/>
+            </w:pPr>
+            <w:r>
+              <w:rPr>
+                <w:rFonts w:ascii="Segoe UI" w:hAnsi="Segoe UI"/>
+                <w:color w:val="1A202C"/>
+                <w:sz w:val="17"/>
+              </w:rPr>
+              <w:t>Formación de Recurso Humano</w:t>
+            </w:r>
+          </w:p>
+        </w:tc>
+        <w:tc>
+          <w:tcPr>
+            <w:tcW w:type="dxa" w:w="3312"/>
+            <w:shd w:fill="FFFFFF"/>
+            <w:tcMar>
+              <w:top w:w="80" w:type="dxa"/>
+              <w:bottom w:w="80" w:type="dxa"/>
+              <w:left w:w="100" w:type="dxa"/>
+              <w:right w:w="100" w:type="dxa"/>
+            </w:tcMar>
+          </w:tcPr>
+          <w:p>
+            <w:pPr>
+              <w:spacing w:before="0" w:after="0"/>
+            </w:pPr>
+            <w:r>
+              <w:rPr>
+                <w:rFonts w:ascii="Segoe UI" w:hAnsi="Segoe UI"/>
+                <w:color w:val="1A202C"/>
+                <w:sz w:val="17"/>
+              </w:rPr>
+              <w:t>Tesis de Doctorado, Trabajos de grado de Maestría/Pregrado y Asesorías Programa Ondas (APO).</w:t>
+            </w:r>
+          </w:p>
+        </w:tc>
+        <w:tc>
+          <w:tcPr>
+            <w:tcW w:type="dxa" w:w="1152"/>
+            <w:shd w:fill="FFFFFF"/>
+            <w:tcMar>
+              <w:top w:w="80" w:type="dxa"/>
+              <w:bottom w:w="80" w:type="dxa"/>
+              <w:left w:w="100" w:type="dxa"/>
+              <w:right w:w="100" w:type="dxa"/>
+            </w:tcMar>
+          </w:tcPr>
+          <w:p>
+            <w:pPr>
+              <w:spacing w:before="0" w:after="0"/>
+            </w:pPr>
+            <w:r>
+              <w:rPr>
+                <w:rFonts w:ascii="Segoe UI" w:hAnsi="Segoe UI"/>
+                <w:color w:val="1A202C"/>
+                <w:sz w:val="17"/>
+              </w:rPr>
+              <w:t>30 - 100</w:t>
             </w:r>
           </w:p>
         </w:tc>

</xml_diff>

<commit_message>
feat(upc-dataset-pdf): ingesta masiva institucional (61 grupos, 3351 productos) y generador de informes PDF estilo GrupLAC con ReportLab
</commit_message>
<xml_diff>
--- a/Documentacion_Tecnica_GrupoXX.docx
+++ b/Documentacion_Tecnica_GrupoXX.docx
@@ -4399,6 +4399,42 @@
     </w:tbl>
     <w:p>
       <w:pPr>
+        <w:spacing w:after="160"/>
+      </w:pPr>
+    </w:p>
+    <w:p>
+      <w:pPr>
+        <w:pStyle w:val="Heading2"/>
+      </w:pPr>
+      <w:r>
+        <w:t>3.4 Generación de Informes Institucionales PDF Estilo GrupLAC (ReportLab)</w:t>
+      </w:r>
+    </w:p>
+    <w:p>
+      <w:r>
+        <w:t>El sistema integra un motor de generación de reportes formales en formato PDF (src/python/core/reporte_pdf.py) utilizando la librería ReportLab. Cada informe reproduce la estructura oficial de la ficha GrupLAC de MinCiencias con los colores institucionales de la Universidad Popular del Cesar (Verde UPC #006837 y Rojo UPC #ED1C24), incluyendo la ficha técnica del grupo, el balance consolidado del Modelo 2024 (5 macro-familias y puntaje IPP), el cuerpo de investigadores adscritos y el catálogo de productos científicos con su estado de validación.</w:t>
+      </w:r>
+    </w:p>
+    <w:p>
+      <w:pPr>
+        <w:spacing w:after="160"/>
+      </w:pPr>
+    </w:p>
+    <w:p>
+      <w:pPr>
+        <w:pStyle w:val="Heading2"/>
+      </w:pPr>
+      <w:r>
+        <w:t>3.5 Dataset Institucional Masivo de la UPC (61 Grupos y 3,335 Productos)</w:t>
+      </w:r>
+    </w:p>
+    <w:p>
+      <w:r>
+        <w:t>Para responder a auditorías de gran escala y evidenciar la escalabilidad y eficiencia de la Multilista Ortogonal 3D, el sistema soporta la carga del dataset institucional completo de la Universidad Popular del Cesar (data/pea_data_upc.json y data/import_pea_json.py). Este repositorio abarca 61 grupos de investigación, más de 350 investigadores y 3,335 productos científicos normalizados y clasificados automáticamente bajo las reglas del Modelo MinCiencias 2024, manteniendo en todo momento la integridad de autorías reales.</w:t>
+      </w:r>
+    </w:p>
+    <w:p>
+      <w:pPr>
         <w:spacing w:after="240"/>
       </w:pPr>
     </w:p>

</xml_diff>

<commit_message>
docs: actualizar documentacion integral (README, SPEC, Word, Guia Video) con modelo 2024, chulo_1 y CvLAC
</commit_message>
<xml_diff>
--- a/Documentacion_Tecnica_GrupoXX.docx
+++ b/Documentacion_Tecnica_GrupoXX.docx
@@ -2680,7 +2680,7 @@
                 <w:color w:val="1A202C"/>
                 <w:sz w:val="17"/>
               </w:rPr>
-              <w:t>Código alfanumérico único institucional/MinCiencias (ej. SCRAP-2099-001).</w:t>
+              <w:t>Código alfanumérico único institucional/MinCiencias (ej. PROD-2099-0001).</w:t>
             </w:r>
           </w:p>
         </w:tc>
@@ -2782,7 +2782,7 @@
                 <w:color w:val="1A202C"/>
                 <w:sz w:val="17"/>
               </w:rPr>
-              <w:t>Tipología: Articulo, Libro, Capitulo, Software, Patente, Trabajo de Grado.</w:t>
+              <w:t>15 Tipologías oficiales: Articulo, Libro, Capitulo, Software, Patente, Trabajo de Grado, Tesis, Jurado, CursoCorto, Evento, Consultoria, Informe, Contenido, Regulacion, Prototipo, Diseno.</w:t>
             </w:r>
           </w:p>
         </w:tc>
@@ -3190,7 +3190,7 @@
                 <w:color w:val="1A202C"/>
                 <w:sz w:val="17"/>
               </w:rPr>
-              <w:t>Aval institucional UPC y reconocimiento MinCiencias (1 = Sí, 0 = No).</w:t>
+              <w:t>Detección fidedigna MinCiencias del aval chulo_1.jpg (1 = Avalado oficialmente en convocatoria, 0 = Pendiente/Sin aval).</w:t>
             </w:r>
           </w:p>
         </w:tc>
@@ -3599,6 +3599,959 @@
                 <w:sz w:val="17"/>
               </w:rPr>
               <w:t>Indicador dinámico si el producto cae en la ventana (últimos 2 o 5 años).</w:t>
+            </w:r>
+          </w:p>
+        </w:tc>
+      </w:tr>
+    </w:tbl>
+    <w:p>
+      <w:pPr>
+        <w:spacing w:after="160"/>
+      </w:pPr>
+    </w:p>
+    <w:p>
+      <w:pPr>
+        <w:pStyle w:val="Heading2"/>
+      </w:pPr>
+      <w:r>
+        <w:t>2.4 Entidad: Perfil del Investigador (Hoja de Vida CvLAC Oficial)</w:t>
+      </w:r>
+    </w:p>
+    <w:tbl>
+      <w:tblPr>
+        <w:tblW w:type="auto" w:w="0"/>
+        <w:jc w:val="center"/>
+        <w:tblLayout w:type="fixed"/>
+        <w:tblLook w:firstColumn="1" w:firstRow="1" w:lastColumn="0" w:lastRow="0" w:noHBand="0" w:noVBand="1" w:val="04A0"/>
+      </w:tblPr>
+      <w:tblGrid>
+        <w:gridCol w:w="2340"/>
+        <w:gridCol w:w="2340"/>
+        <w:gridCol w:w="2340"/>
+        <w:gridCol w:w="2340"/>
+      </w:tblGrid>
+      <w:tr>
+        <w:tc>
+          <w:tcPr>
+            <w:tcW w:type="dxa" w:w="2592"/>
+            <w:shd w:fill="006837"/>
+            <w:tcMar>
+              <w:top w:w="120" w:type="dxa"/>
+              <w:bottom w:w="120" w:type="dxa"/>
+              <w:left w:w="120" w:type="dxa"/>
+              <w:right w:w="120" w:type="dxa"/>
+            </w:tcMar>
+          </w:tcPr>
+          <w:p>
+            <w:pPr>
+              <w:spacing w:before="0" w:after="0"/>
+              <w:jc w:val="center"/>
+            </w:pPr>
+            <w:r>
+              <w:rPr>
+                <w:rFonts w:ascii="Segoe UI" w:hAnsi="Segoe UI"/>
+                <w:b/>
+                <w:color w:val="FFFFFF"/>
+                <w:sz w:val="18"/>
+              </w:rPr>
+              <w:t>Variable</w:t>
+            </w:r>
+          </w:p>
+        </w:tc>
+        <w:tc>
+          <w:tcPr>
+            <w:tcW w:type="dxa" w:w="1584"/>
+            <w:shd w:fill="006837"/>
+            <w:tcMar>
+              <w:top w:w="120" w:type="dxa"/>
+              <w:bottom w:w="120" w:type="dxa"/>
+              <w:left w:w="120" w:type="dxa"/>
+              <w:right w:w="120" w:type="dxa"/>
+            </w:tcMar>
+          </w:tcPr>
+          <w:p>
+            <w:pPr>
+              <w:spacing w:before="0" w:after="0"/>
+              <w:jc w:val="center"/>
+            </w:pPr>
+            <w:r>
+              <w:rPr>
+                <w:rFonts w:ascii="Segoe UI" w:hAnsi="Segoe UI"/>
+                <w:b/>
+                <w:color w:val="FFFFFF"/>
+                <w:sz w:val="18"/>
+              </w:rPr>
+              <w:t>Tipo de Dato</w:t>
+            </w:r>
+          </w:p>
+        </w:tc>
+        <w:tc>
+          <w:tcPr>
+            <w:tcW w:type="dxa" w:w="864"/>
+            <w:shd w:fill="006837"/>
+            <w:tcMar>
+              <w:top w:w="120" w:type="dxa"/>
+              <w:bottom w:w="120" w:type="dxa"/>
+              <w:left w:w="120" w:type="dxa"/>
+              <w:right w:w="120" w:type="dxa"/>
+            </w:tcMar>
+          </w:tcPr>
+          <w:p>
+            <w:pPr>
+              <w:spacing w:before="0" w:after="0"/>
+              <w:jc w:val="center"/>
+            </w:pPr>
+            <w:r>
+              <w:rPr>
+                <w:rFonts w:ascii="Segoe UI" w:hAnsi="Segoe UI"/>
+                <w:b/>
+                <w:color w:val="FFFFFF"/>
+                <w:sz w:val="18"/>
+              </w:rPr>
+              <w:t>E/S</w:t>
+            </w:r>
+          </w:p>
+        </w:tc>
+        <w:tc>
+          <w:tcPr>
+            <w:tcW w:type="dxa" w:w="4320"/>
+            <w:shd w:fill="006837"/>
+            <w:tcMar>
+              <w:top w:w="120" w:type="dxa"/>
+              <w:bottom w:w="120" w:type="dxa"/>
+              <w:left w:w="120" w:type="dxa"/>
+              <w:right w:w="120" w:type="dxa"/>
+            </w:tcMar>
+          </w:tcPr>
+          <w:p>
+            <w:pPr>
+              <w:spacing w:before="0" w:after="0"/>
+              <w:jc w:val="center"/>
+            </w:pPr>
+            <w:r>
+              <w:rPr>
+                <w:rFonts w:ascii="Segoe UI" w:hAnsi="Segoe UI"/>
+                <w:b/>
+                <w:color w:val="FFFFFF"/>
+                <w:sz w:val="18"/>
+              </w:rPr>
+              <w:t>Descripción y Reglas de Negocio</w:t>
+            </w:r>
+          </w:p>
+        </w:tc>
+      </w:tr>
+      <w:tr>
+        <w:tc>
+          <w:tcPr>
+            <w:tcW w:type="dxa" w:w="2592"/>
+            <w:shd w:fill="FFFFFF"/>
+            <w:tcMar>
+              <w:top w:w="80" w:type="dxa"/>
+              <w:bottom w:w="80" w:type="dxa"/>
+              <w:left w:w="100" w:type="dxa"/>
+              <w:right w:w="100" w:type="dxa"/>
+            </w:tcMar>
+          </w:tcPr>
+          <w:p>
+            <w:pPr>
+              <w:spacing w:before="0" w:after="0"/>
+            </w:pPr>
+            <w:r>
+              <w:rPr>
+                <w:rFonts w:ascii="Segoe UI" w:hAnsi="Segoe UI"/>
+                <w:color w:val="1A202C"/>
+                <w:sz w:val="17"/>
+              </w:rPr>
+              <w:t>documento_id</w:t>
+            </w:r>
+          </w:p>
+        </w:tc>
+        <w:tc>
+          <w:tcPr>
+            <w:tcW w:type="dxa" w:w="1584"/>
+            <w:shd w:fill="FFFFFF"/>
+            <w:tcMar>
+              <w:top w:w="80" w:type="dxa"/>
+              <w:bottom w:w="80" w:type="dxa"/>
+              <w:left w:w="100" w:type="dxa"/>
+              <w:right w:w="100" w:type="dxa"/>
+            </w:tcMar>
+          </w:tcPr>
+          <w:p>
+            <w:pPr>
+              <w:spacing w:before="0" w:after="0"/>
+            </w:pPr>
+            <w:r>
+              <w:rPr>
+                <w:rFonts w:ascii="Segoe UI" w:hAnsi="Segoe UI"/>
+                <w:color w:val="1A202C"/>
+                <w:sz w:val="17"/>
+              </w:rPr>
+              <w:t>Cadena (Texto)</w:t>
+            </w:r>
+          </w:p>
+        </w:tc>
+        <w:tc>
+          <w:tcPr>
+            <w:tcW w:type="dxa" w:w="864"/>
+            <w:shd w:fill="FFFFFF"/>
+            <w:tcMar>
+              <w:top w:w="80" w:type="dxa"/>
+              <w:bottom w:w="80" w:type="dxa"/>
+              <w:left w:w="100" w:type="dxa"/>
+              <w:right w:w="100" w:type="dxa"/>
+            </w:tcMar>
+          </w:tcPr>
+          <w:p>
+            <w:pPr>
+              <w:spacing w:before="0" w:after="0"/>
+            </w:pPr>
+            <w:r>
+              <w:rPr>
+                <w:rFonts w:ascii="Segoe UI" w:hAnsi="Segoe UI"/>
+                <w:color w:val="1A202C"/>
+                <w:sz w:val="17"/>
+              </w:rPr>
+              <w:t>Entrada</w:t>
+            </w:r>
+          </w:p>
+        </w:tc>
+        <w:tc>
+          <w:tcPr>
+            <w:tcW w:type="dxa" w:w="4320"/>
+            <w:shd w:fill="FFFFFF"/>
+            <w:tcMar>
+              <w:top w:w="80" w:type="dxa"/>
+              <w:bottom w:w="80" w:type="dxa"/>
+              <w:left w:w="100" w:type="dxa"/>
+              <w:right w:w="100" w:type="dxa"/>
+            </w:tcMar>
+          </w:tcPr>
+          <w:p>
+            <w:pPr>
+              <w:spacing w:before="0" w:after="0"/>
+            </w:pPr>
+            <w:r>
+              <w:rPr>
+                <w:rFonts w:ascii="Segoe UI" w:hAnsi="Segoe UI"/>
+                <w:color w:val="1A202C"/>
+                <w:sz w:val="17"/>
+              </w:rPr>
+              <w:t>Cédula de ciudadanía o código CvLAC (cod_rh). Clave primaria y FK a Investigadores.</w:t>
+            </w:r>
+          </w:p>
+        </w:tc>
+      </w:tr>
+      <w:tr>
+        <w:tc>
+          <w:tcPr>
+            <w:tcW w:type="dxa" w:w="2592"/>
+            <w:shd w:fill="F8F9FA"/>
+            <w:tcMar>
+              <w:top w:w="80" w:type="dxa"/>
+              <w:bottom w:w="80" w:type="dxa"/>
+              <w:left w:w="100" w:type="dxa"/>
+              <w:right w:w="100" w:type="dxa"/>
+            </w:tcMar>
+          </w:tcPr>
+          <w:p>
+            <w:pPr>
+              <w:spacing w:before="0" w:after="0"/>
+            </w:pPr>
+            <w:r>
+              <w:rPr>
+                <w:rFonts w:ascii="Segoe UI" w:hAnsi="Segoe UI"/>
+                <w:color w:val="1A202C"/>
+                <w:sz w:val="17"/>
+              </w:rPr>
+              <w:t>par_evaluador</w:t>
+            </w:r>
+          </w:p>
+        </w:tc>
+        <w:tc>
+          <w:tcPr>
+            <w:tcW w:type="dxa" w:w="1584"/>
+            <w:shd w:fill="F8F9FA"/>
+            <w:tcMar>
+              <w:top w:w="80" w:type="dxa"/>
+              <w:bottom w:w="80" w:type="dxa"/>
+              <w:left w:w="100" w:type="dxa"/>
+              <w:right w:w="100" w:type="dxa"/>
+            </w:tcMar>
+          </w:tcPr>
+          <w:p>
+            <w:pPr>
+              <w:spacing w:before="0" w:after="0"/>
+            </w:pPr>
+            <w:r>
+              <w:rPr>
+                <w:rFonts w:ascii="Segoe UI" w:hAnsi="Segoe UI"/>
+                <w:color w:val="1A202C"/>
+                <w:sz w:val="17"/>
+              </w:rPr>
+              <w:t>Cadena (Enum)</w:t>
+            </w:r>
+          </w:p>
+        </w:tc>
+        <w:tc>
+          <w:tcPr>
+            <w:tcW w:type="dxa" w:w="864"/>
+            <w:shd w:fill="F8F9FA"/>
+            <w:tcMar>
+              <w:top w:w="80" w:type="dxa"/>
+              <w:bottom w:w="80" w:type="dxa"/>
+              <w:left w:w="100" w:type="dxa"/>
+              <w:right w:w="100" w:type="dxa"/>
+            </w:tcMar>
+          </w:tcPr>
+          <w:p>
+            <w:pPr>
+              <w:spacing w:before="0" w:after="0"/>
+            </w:pPr>
+            <w:r>
+              <w:rPr>
+                <w:rFonts w:ascii="Segoe UI" w:hAnsi="Segoe UI"/>
+                <w:color w:val="1A202C"/>
+                <w:sz w:val="17"/>
+              </w:rPr>
+              <w:t>Entrada</w:t>
+            </w:r>
+          </w:p>
+        </w:tc>
+        <w:tc>
+          <w:tcPr>
+            <w:tcW w:type="dxa" w:w="4320"/>
+            <w:shd w:fill="F8F9FA"/>
+            <w:tcMar>
+              <w:top w:w="80" w:type="dxa"/>
+              <w:bottom w:w="80" w:type="dxa"/>
+              <w:left w:w="100" w:type="dxa"/>
+              <w:right w:w="100" w:type="dxa"/>
+            </w:tcMar>
+          </w:tcPr>
+          <w:p>
+            <w:pPr>
+              <w:spacing w:before="0" w:after="0"/>
+            </w:pPr>
+            <w:r>
+              <w:rPr>
+                <w:rFonts w:ascii="Segoe UI" w:hAnsi="Segoe UI"/>
+                <w:color w:val="1A202C"/>
+                <w:sz w:val="17"/>
+              </w:rPr>
+              <w:t>Reconocimiento oficial MinCiencias como Par Evaluador (Si / No).</w:t>
+            </w:r>
+          </w:p>
+        </w:tc>
+      </w:tr>
+      <w:tr>
+        <w:tc>
+          <w:tcPr>
+            <w:tcW w:type="dxa" w:w="2592"/>
+            <w:shd w:fill="FFFFFF"/>
+            <w:tcMar>
+              <w:top w:w="80" w:type="dxa"/>
+              <w:bottom w:w="80" w:type="dxa"/>
+              <w:left w:w="100" w:type="dxa"/>
+              <w:right w:w="100" w:type="dxa"/>
+            </w:tcMar>
+          </w:tcPr>
+          <w:p>
+            <w:pPr>
+              <w:spacing w:before="0" w:after="0"/>
+            </w:pPr>
+            <w:r>
+              <w:rPr>
+                <w:rFonts w:ascii="Segoe UI" w:hAnsi="Segoe UI"/>
+                <w:color w:val="1A202C"/>
+                <w:sz w:val="17"/>
+              </w:rPr>
+              <w:t>nombre_citaciones</w:t>
+            </w:r>
+          </w:p>
+        </w:tc>
+        <w:tc>
+          <w:tcPr>
+            <w:tcW w:type="dxa" w:w="1584"/>
+            <w:shd w:fill="FFFFFF"/>
+            <w:tcMar>
+              <w:top w:w="80" w:type="dxa"/>
+              <w:bottom w:w="80" w:type="dxa"/>
+              <w:left w:w="100" w:type="dxa"/>
+              <w:right w:w="100" w:type="dxa"/>
+            </w:tcMar>
+          </w:tcPr>
+          <w:p>
+            <w:pPr>
+              <w:spacing w:before="0" w:after="0"/>
+            </w:pPr>
+            <w:r>
+              <w:rPr>
+                <w:rFonts w:ascii="Segoe UI" w:hAnsi="Segoe UI"/>
+                <w:color w:val="1A202C"/>
+                <w:sz w:val="17"/>
+              </w:rPr>
+              <w:t>Cadena (Texto)</w:t>
+            </w:r>
+          </w:p>
+        </w:tc>
+        <w:tc>
+          <w:tcPr>
+            <w:tcW w:type="dxa" w:w="864"/>
+            <w:shd w:fill="FFFFFF"/>
+            <w:tcMar>
+              <w:top w:w="80" w:type="dxa"/>
+              <w:bottom w:w="80" w:type="dxa"/>
+              <w:left w:w="100" w:type="dxa"/>
+              <w:right w:w="100" w:type="dxa"/>
+            </w:tcMar>
+          </w:tcPr>
+          <w:p>
+            <w:pPr>
+              <w:spacing w:before="0" w:after="0"/>
+            </w:pPr>
+            <w:r>
+              <w:rPr>
+                <w:rFonts w:ascii="Segoe UI" w:hAnsi="Segoe UI"/>
+                <w:color w:val="1A202C"/>
+                <w:sz w:val="17"/>
+              </w:rPr>
+              <w:t>Entrada</w:t>
+            </w:r>
+          </w:p>
+        </w:tc>
+        <w:tc>
+          <w:tcPr>
+            <w:tcW w:type="dxa" w:w="4320"/>
+            <w:shd w:fill="FFFFFF"/>
+            <w:tcMar>
+              <w:top w:w="80" w:type="dxa"/>
+              <w:bottom w:w="80" w:type="dxa"/>
+              <w:left w:w="100" w:type="dxa"/>
+              <w:right w:w="100" w:type="dxa"/>
+            </w:tcMar>
+          </w:tcPr>
+          <w:p>
+            <w:pPr>
+              <w:spacing w:before="0" w:after="0"/>
+            </w:pPr>
+            <w:r>
+              <w:rPr>
+                <w:rFonts w:ascii="Segoe UI" w:hAnsi="Segoe UI"/>
+                <w:color w:val="1A202C"/>
+                <w:sz w:val="17"/>
+              </w:rPr>
+              <w:t>Firma científica normalizada para citaciones bibliográficas internacionales.</w:t>
+            </w:r>
+          </w:p>
+        </w:tc>
+      </w:tr>
+      <w:tr>
+        <w:tc>
+          <w:tcPr>
+            <w:tcW w:type="dxa" w:w="2592"/>
+            <w:shd w:fill="F8F9FA"/>
+            <w:tcMar>
+              <w:top w:w="80" w:type="dxa"/>
+              <w:bottom w:w="80" w:type="dxa"/>
+              <w:left w:w="100" w:type="dxa"/>
+              <w:right w:w="100" w:type="dxa"/>
+            </w:tcMar>
+          </w:tcPr>
+          <w:p>
+            <w:pPr>
+              <w:spacing w:before="0" w:after="0"/>
+            </w:pPr>
+            <w:r>
+              <w:rPr>
+                <w:rFonts w:ascii="Segoe UI" w:hAnsi="Segoe UI"/>
+                <w:color w:val="1A202C"/>
+                <w:sz w:val="17"/>
+              </w:rPr>
+              <w:t>nacionalidad</w:t>
+            </w:r>
+          </w:p>
+        </w:tc>
+        <w:tc>
+          <w:tcPr>
+            <w:tcW w:type="dxa" w:w="1584"/>
+            <w:shd w:fill="F8F9FA"/>
+            <w:tcMar>
+              <w:top w:w="80" w:type="dxa"/>
+              <w:bottom w:w="80" w:type="dxa"/>
+              <w:left w:w="100" w:type="dxa"/>
+              <w:right w:w="100" w:type="dxa"/>
+            </w:tcMar>
+          </w:tcPr>
+          <w:p>
+            <w:pPr>
+              <w:spacing w:before="0" w:after="0"/>
+            </w:pPr>
+            <w:r>
+              <w:rPr>
+                <w:rFonts w:ascii="Segoe UI" w:hAnsi="Segoe UI"/>
+                <w:color w:val="1A202C"/>
+                <w:sz w:val="17"/>
+              </w:rPr>
+              <w:t>Cadena (Texto)</w:t>
+            </w:r>
+          </w:p>
+        </w:tc>
+        <w:tc>
+          <w:tcPr>
+            <w:tcW w:type="dxa" w:w="864"/>
+            <w:shd w:fill="F8F9FA"/>
+            <w:tcMar>
+              <w:top w:w="80" w:type="dxa"/>
+              <w:bottom w:w="80" w:type="dxa"/>
+              <w:left w:w="100" w:type="dxa"/>
+              <w:right w:w="100" w:type="dxa"/>
+            </w:tcMar>
+          </w:tcPr>
+          <w:p>
+            <w:pPr>
+              <w:spacing w:before="0" w:after="0"/>
+            </w:pPr>
+            <w:r>
+              <w:rPr>
+                <w:rFonts w:ascii="Segoe UI" w:hAnsi="Segoe UI"/>
+                <w:color w:val="1A202C"/>
+                <w:sz w:val="17"/>
+              </w:rPr>
+              <w:t>Entrada</w:t>
+            </w:r>
+          </w:p>
+        </w:tc>
+        <w:tc>
+          <w:tcPr>
+            <w:tcW w:type="dxa" w:w="4320"/>
+            <w:shd w:fill="F8F9FA"/>
+            <w:tcMar>
+              <w:top w:w="80" w:type="dxa"/>
+              <w:bottom w:w="80" w:type="dxa"/>
+              <w:left w:w="100" w:type="dxa"/>
+              <w:right w:w="100" w:type="dxa"/>
+            </w:tcMar>
+          </w:tcPr>
+          <w:p>
+            <w:pPr>
+              <w:spacing w:before="0" w:after="0"/>
+            </w:pPr>
+            <w:r>
+              <w:rPr>
+                <w:rFonts w:ascii="Segoe UI" w:hAnsi="Segoe UI"/>
+                <w:color w:val="1A202C"/>
+                <w:sz w:val="17"/>
+              </w:rPr>
+              <w:t>País de origen reportado en el currículo vitae.</w:t>
+            </w:r>
+          </w:p>
+        </w:tc>
+      </w:tr>
+      <w:tr>
+        <w:tc>
+          <w:tcPr>
+            <w:tcW w:type="dxa" w:w="2592"/>
+            <w:shd w:fill="FFFFFF"/>
+            <w:tcMar>
+              <w:top w:w="80" w:type="dxa"/>
+              <w:bottom w:w="80" w:type="dxa"/>
+              <w:left w:w="100" w:type="dxa"/>
+              <w:right w:w="100" w:type="dxa"/>
+            </w:tcMar>
+          </w:tcPr>
+          <w:p>
+            <w:pPr>
+              <w:spacing w:before="0" w:after="0"/>
+            </w:pPr>
+            <w:r>
+              <w:rPr>
+                <w:rFonts w:ascii="Segoe UI" w:hAnsi="Segoe UI"/>
+                <w:color w:val="1A202C"/>
+                <w:sz w:val="17"/>
+              </w:rPr>
+              <w:t>sexo</w:t>
+            </w:r>
+          </w:p>
+        </w:tc>
+        <w:tc>
+          <w:tcPr>
+            <w:tcW w:type="dxa" w:w="1584"/>
+            <w:shd w:fill="FFFFFF"/>
+            <w:tcMar>
+              <w:top w:w="80" w:type="dxa"/>
+              <w:bottom w:w="80" w:type="dxa"/>
+              <w:left w:w="100" w:type="dxa"/>
+              <w:right w:w="100" w:type="dxa"/>
+            </w:tcMar>
+          </w:tcPr>
+          <w:p>
+            <w:pPr>
+              <w:spacing w:before="0" w:after="0"/>
+            </w:pPr>
+            <w:r>
+              <w:rPr>
+                <w:rFonts w:ascii="Segoe UI" w:hAnsi="Segoe UI"/>
+                <w:color w:val="1A202C"/>
+                <w:sz w:val="17"/>
+              </w:rPr>
+              <w:t>Cadena (Texto)</w:t>
+            </w:r>
+          </w:p>
+        </w:tc>
+        <w:tc>
+          <w:tcPr>
+            <w:tcW w:type="dxa" w:w="864"/>
+            <w:shd w:fill="FFFFFF"/>
+            <w:tcMar>
+              <w:top w:w="80" w:type="dxa"/>
+              <w:bottom w:w="80" w:type="dxa"/>
+              <w:left w:w="100" w:type="dxa"/>
+              <w:right w:w="100" w:type="dxa"/>
+            </w:tcMar>
+          </w:tcPr>
+          <w:p>
+            <w:pPr>
+              <w:spacing w:before="0" w:after="0"/>
+            </w:pPr>
+            <w:r>
+              <w:rPr>
+                <w:rFonts w:ascii="Segoe UI" w:hAnsi="Segoe UI"/>
+                <w:color w:val="1A202C"/>
+                <w:sz w:val="17"/>
+              </w:rPr>
+              <w:t>Entrada</w:t>
+            </w:r>
+          </w:p>
+        </w:tc>
+        <w:tc>
+          <w:tcPr>
+            <w:tcW w:type="dxa" w:w="4320"/>
+            <w:shd w:fill="FFFFFF"/>
+            <w:tcMar>
+              <w:top w:w="80" w:type="dxa"/>
+              <w:bottom w:w="80" w:type="dxa"/>
+              <w:left w:w="100" w:type="dxa"/>
+              <w:right w:w="100" w:type="dxa"/>
+            </w:tcMar>
+          </w:tcPr>
+          <w:p>
+            <w:pPr>
+              <w:spacing w:before="0" w:after="0"/>
+            </w:pPr>
+            <w:r>
+              <w:rPr>
+                <w:rFonts w:ascii="Segoe UI" w:hAnsi="Segoe UI"/>
+                <w:color w:val="1A202C"/>
+                <w:sz w:val="17"/>
+              </w:rPr>
+              <w:t>Sexo registrado en la ficha oficial CvLAC.</w:t>
+            </w:r>
+          </w:p>
+        </w:tc>
+      </w:tr>
+      <w:tr>
+        <w:tc>
+          <w:tcPr>
+            <w:tcW w:type="dxa" w:w="2592"/>
+            <w:shd w:fill="F8F9FA"/>
+            <w:tcMar>
+              <w:top w:w="80" w:type="dxa"/>
+              <w:bottom w:w="80" w:type="dxa"/>
+              <w:left w:w="100" w:type="dxa"/>
+              <w:right w:w="100" w:type="dxa"/>
+            </w:tcMar>
+          </w:tcPr>
+          <w:p>
+            <w:pPr>
+              <w:spacing w:before="0" w:after="0"/>
+            </w:pPr>
+            <w:r>
+              <w:rPr>
+                <w:rFonts w:ascii="Segoe UI" w:hAnsi="Segoe UI"/>
+                <w:color w:val="1A202C"/>
+                <w:sz w:val="17"/>
+              </w:rPr>
+              <w:t>scholar_url</w:t>
+            </w:r>
+          </w:p>
+        </w:tc>
+        <w:tc>
+          <w:tcPr>
+            <w:tcW w:type="dxa" w:w="1584"/>
+            <w:shd w:fill="F8F9FA"/>
+            <w:tcMar>
+              <w:top w:w="80" w:type="dxa"/>
+              <w:bottom w:w="80" w:type="dxa"/>
+              <w:left w:w="100" w:type="dxa"/>
+              <w:right w:w="100" w:type="dxa"/>
+            </w:tcMar>
+          </w:tcPr>
+          <w:p>
+            <w:pPr>
+              <w:spacing w:before="0" w:after="0"/>
+            </w:pPr>
+            <w:r>
+              <w:rPr>
+                <w:rFonts w:ascii="Segoe UI" w:hAnsi="Segoe UI"/>
+                <w:color w:val="1A202C"/>
+                <w:sz w:val="17"/>
+              </w:rPr>
+              <w:t>Cadena (URL)</w:t>
+            </w:r>
+          </w:p>
+        </w:tc>
+        <w:tc>
+          <w:tcPr>
+            <w:tcW w:type="dxa" w:w="864"/>
+            <w:shd w:fill="F8F9FA"/>
+            <w:tcMar>
+              <w:top w:w="80" w:type="dxa"/>
+              <w:bottom w:w="80" w:type="dxa"/>
+              <w:left w:w="100" w:type="dxa"/>
+              <w:right w:w="100" w:type="dxa"/>
+            </w:tcMar>
+          </w:tcPr>
+          <w:p>
+            <w:pPr>
+              <w:spacing w:before="0" w:after="0"/>
+            </w:pPr>
+            <w:r>
+              <w:rPr>
+                <w:rFonts w:ascii="Segoe UI" w:hAnsi="Segoe UI"/>
+                <w:color w:val="1A202C"/>
+                <w:sz w:val="17"/>
+              </w:rPr>
+              <w:t>Entrada</w:t>
+            </w:r>
+          </w:p>
+        </w:tc>
+        <w:tc>
+          <w:tcPr>
+            <w:tcW w:type="dxa" w:w="4320"/>
+            <w:shd w:fill="F8F9FA"/>
+            <w:tcMar>
+              <w:top w:w="80" w:type="dxa"/>
+              <w:bottom w:w="80" w:type="dxa"/>
+              <w:left w:w="100" w:type="dxa"/>
+              <w:right w:w="100" w:type="dxa"/>
+            </w:tcMar>
+          </w:tcPr>
+          <w:p>
+            <w:pPr>
+              <w:spacing w:before="0" w:after="0"/>
+            </w:pPr>
+            <w:r>
+              <w:rPr>
+                <w:rFonts w:ascii="Segoe UI" w:hAnsi="Segoe UI"/>
+                <w:color w:val="1A202C"/>
+                <w:sz w:val="17"/>
+              </w:rPr>
+              <w:t>Enlace verificado al perfil académico de Google Scholar.</w:t>
+            </w:r>
+          </w:p>
+        </w:tc>
+      </w:tr>
+      <w:tr>
+        <w:tc>
+          <w:tcPr>
+            <w:tcW w:type="dxa" w:w="2592"/>
+            <w:shd w:fill="FFFFFF"/>
+            <w:tcMar>
+              <w:top w:w="80" w:type="dxa"/>
+              <w:bottom w:w="80" w:type="dxa"/>
+              <w:left w:w="100" w:type="dxa"/>
+              <w:right w:w="100" w:type="dxa"/>
+            </w:tcMar>
+          </w:tcPr>
+          <w:p>
+            <w:pPr>
+              <w:spacing w:before="0" w:after="0"/>
+            </w:pPr>
+            <w:r>
+              <w:rPr>
+                <w:rFonts w:ascii="Segoe UI" w:hAnsi="Segoe UI"/>
+                <w:color w:val="1A202C"/>
+                <w:sz w:val="17"/>
+              </w:rPr>
+              <w:t>orcid</w:t>
+            </w:r>
+          </w:p>
+        </w:tc>
+        <w:tc>
+          <w:tcPr>
+            <w:tcW w:type="dxa" w:w="1584"/>
+            <w:shd w:fill="FFFFFF"/>
+            <w:tcMar>
+              <w:top w:w="80" w:type="dxa"/>
+              <w:bottom w:w="80" w:type="dxa"/>
+              <w:left w:w="100" w:type="dxa"/>
+              <w:right w:w="100" w:type="dxa"/>
+            </w:tcMar>
+          </w:tcPr>
+          <w:p>
+            <w:pPr>
+              <w:spacing w:before="0" w:after="0"/>
+            </w:pPr>
+            <w:r>
+              <w:rPr>
+                <w:rFonts w:ascii="Segoe UI" w:hAnsi="Segoe UI"/>
+                <w:color w:val="1A202C"/>
+                <w:sz w:val="17"/>
+              </w:rPr>
+              <w:t>Cadena (URL)</w:t>
+            </w:r>
+          </w:p>
+        </w:tc>
+        <w:tc>
+          <w:tcPr>
+            <w:tcW w:type="dxa" w:w="864"/>
+            <w:shd w:fill="FFFFFF"/>
+            <w:tcMar>
+              <w:top w:w="80" w:type="dxa"/>
+              <w:bottom w:w="80" w:type="dxa"/>
+              <w:left w:w="100" w:type="dxa"/>
+              <w:right w:w="100" w:type="dxa"/>
+            </w:tcMar>
+          </w:tcPr>
+          <w:p>
+            <w:pPr>
+              <w:spacing w:before="0" w:after="0"/>
+            </w:pPr>
+            <w:r>
+              <w:rPr>
+                <w:rFonts w:ascii="Segoe UI" w:hAnsi="Segoe UI"/>
+                <w:color w:val="1A202C"/>
+                <w:sz w:val="17"/>
+              </w:rPr>
+              <w:t>Entrada</w:t>
+            </w:r>
+          </w:p>
+        </w:tc>
+        <w:tc>
+          <w:tcPr>
+            <w:tcW w:type="dxa" w:w="4320"/>
+            <w:shd w:fill="FFFFFF"/>
+            <w:tcMar>
+              <w:top w:w="80" w:type="dxa"/>
+              <w:bottom w:w="80" w:type="dxa"/>
+              <w:left w:w="100" w:type="dxa"/>
+              <w:right w:w="100" w:type="dxa"/>
+            </w:tcMar>
+          </w:tcPr>
+          <w:p>
+            <w:pPr>
+              <w:spacing w:before="0" w:after="0"/>
+            </w:pPr>
+            <w:r>
+              <w:rPr>
+                <w:rFonts w:ascii="Segoe UI" w:hAnsi="Segoe UI"/>
+                <w:color w:val="1A202C"/>
+                <w:sz w:val="17"/>
+              </w:rPr>
+              <w:t>Identificador persistente digital internacional ORCID.</w:t>
+            </w:r>
+          </w:p>
+        </w:tc>
+      </w:tr>
+      <w:tr>
+        <w:tc>
+          <w:tcPr>
+            <w:tcW w:type="dxa" w:w="2592"/>
+            <w:shd w:fill="F8F9FA"/>
+            <w:tcMar>
+              <w:top w:w="80" w:type="dxa"/>
+              <w:bottom w:w="80" w:type="dxa"/>
+              <w:left w:w="100" w:type="dxa"/>
+              <w:right w:w="100" w:type="dxa"/>
+            </w:tcMar>
+          </w:tcPr>
+          <w:p>
+            <w:pPr>
+              <w:spacing w:before="0" w:after="0"/>
+            </w:pPr>
+            <w:r>
+              <w:rPr>
+                <w:rFonts w:ascii="Segoe UI" w:hAnsi="Segoe UI"/>
+                <w:color w:val="1A202C"/>
+                <w:sz w:val="17"/>
+              </w:rPr>
+              <w:t>formacion_academica</w:t>
+            </w:r>
+          </w:p>
+        </w:tc>
+        <w:tc>
+          <w:tcPr>
+            <w:tcW w:type="dxa" w:w="1584"/>
+            <w:shd w:fill="F8F9FA"/>
+            <w:tcMar>
+              <w:top w:w="80" w:type="dxa"/>
+              <w:bottom w:w="80" w:type="dxa"/>
+              <w:left w:w="100" w:type="dxa"/>
+              <w:right w:w="100" w:type="dxa"/>
+            </w:tcMar>
+          </w:tcPr>
+          <w:p>
+            <w:pPr>
+              <w:spacing w:before="0" w:after="0"/>
+            </w:pPr>
+            <w:r>
+              <w:rPr>
+                <w:rFonts w:ascii="Segoe UI" w:hAnsi="Segoe UI"/>
+                <w:color w:val="1A202C"/>
+                <w:sz w:val="17"/>
+              </w:rPr>
+              <w:t>Cadena (Texto)</w:t>
+            </w:r>
+          </w:p>
+        </w:tc>
+        <w:tc>
+          <w:tcPr>
+            <w:tcW w:type="dxa" w:w="864"/>
+            <w:shd w:fill="F8F9FA"/>
+            <w:tcMar>
+              <w:top w:w="80" w:type="dxa"/>
+              <w:bottom w:w="80" w:type="dxa"/>
+              <w:left w:w="100" w:type="dxa"/>
+              <w:right w:w="100" w:type="dxa"/>
+            </w:tcMar>
+          </w:tcPr>
+          <w:p>
+            <w:pPr>
+              <w:spacing w:before="0" w:after="0"/>
+            </w:pPr>
+            <w:r>
+              <w:rPr>
+                <w:rFonts w:ascii="Segoe UI" w:hAnsi="Segoe UI"/>
+                <w:color w:val="1A202C"/>
+                <w:sz w:val="17"/>
+              </w:rPr>
+              <w:t>Entrada</w:t>
+            </w:r>
+          </w:p>
+        </w:tc>
+        <w:tc>
+          <w:tcPr>
+            <w:tcW w:type="dxa" w:w="4320"/>
+            <w:shd w:fill="F8F9FA"/>
+            <w:tcMar>
+              <w:top w:w="80" w:type="dxa"/>
+              <w:bottom w:w="80" w:type="dxa"/>
+              <w:left w:w="100" w:type="dxa"/>
+              <w:right w:w="100" w:type="dxa"/>
+            </w:tcMar>
+          </w:tcPr>
+          <w:p>
+            <w:pPr>
+              <w:spacing w:before="0" w:after="0"/>
+            </w:pPr>
+            <w:r>
+              <w:rPr>
+                <w:rFonts w:ascii="Segoe UI" w:hAnsi="Segoe UI"/>
+                <w:color w:val="1A202C"/>
+                <w:sz w:val="17"/>
+              </w:rPr>
+              <w:t>Máximo nivel educativo formal alcanzado (Doctorado, Maestría, Pregrado).</w:t>
             </w:r>
           </w:p>
         </w:tc>

</xml_diff>

<commit_message>
feat(docs): actualizar generador Word e incrustar suite de 11 diagramas y catalogo 2024
</commit_message>
<xml_diff>
--- a/Documentacion_Tecnica_GrupoXX.docx
+++ b/Documentacion_Tecnica_GrupoXX.docx
@@ -410,7 +410,7 @@
                 <w:color w:val="006837"/>
                 <w:sz w:val="21"/>
               </w:rPr>
-              <w:t>📌 Principio de Arquitectura: 'Consola Primero' y Desacoplamiento</w:t>
+              <w:t>[ESPECIFICACION] Principio de Arquitectura: 'Consola Primero' y Desacoplamiento</w:t>
               <w:br/>
             </w:r>
             <w:r>
@@ -5449,7 +5449,7 @@
                 <w:color w:val="006837"/>
                 <w:sz w:val="21"/>
               </w:rPr>
-              <w:t>📌 RF-01: Carga Dual de Persistencia (Pregunta Inicial de Ejecución)</w:t>
+              <w:t>[ESPECIFICACION] RF-01: Carga Dual de Persistencia (Pregunta Inicial de Ejecución)</w:t>
               <w:br/>
             </w:r>
             <w:r>
@@ -5516,7 +5516,7 @@
                 <w:color w:val="006837"/>
                 <w:sz w:val="21"/>
               </w:rPr>
-              <w:t>📌 RF-02: Atribución Real de Autoría y Desagregación Multi-Investigador</w:t>
+              <w:t>[ESPECIFICACION] RF-02: Atribución Real de Autoría y Desagregación Multi-Investigador</w:t>
               <w:br/>
             </w:r>
             <w:r>
@@ -5581,7 +5581,7 @@
                 <w:color w:val="006837"/>
                 <w:sz w:val="21"/>
               </w:rPr>
-              <w:t>📌 RF-03: Filtrado por Ventana de Observación (Últimos 2 y 5 Años)</w:t>
+              <w:t>[ESPECIFICACION] RF-03: Filtrado por Ventana de Observación (Últimos 2 y 5 Años)</w:t>
               <w:br/>
             </w:r>
             <w:r>
@@ -5719,7 +5719,7 @@
                 <w:color w:val="006837"/>
                 <w:sz w:val="21"/>
               </w:rPr>
-              <w:t>📌 HU-01: Gestión de Entidades Científicas (CRUD Completo)</w:t>
+              <w:t>[ESPECIFICACION] HU-01: Gestión de Entidades Científicas (CRUD Completo)</w:t>
               <w:br/>
             </w:r>
             <w:r>
@@ -5793,7 +5793,7 @@
                 <w:color w:val="006837"/>
                 <w:sz w:val="21"/>
               </w:rPr>
-              <w:t>📌 HU-02: Desactivación Lógica vs. Eliminación Física</w:t>
+              <w:t>[ESPECIFICACION] HU-02: Desactivación Lógica vs. Eliminación Física</w:t>
               <w:br/>
             </w:r>
             <w:r>
@@ -5867,7 +5867,7 @@
                 <w:color w:val="006837"/>
                 <w:sz w:val="21"/>
               </w:rPr>
-              <w:t>📌 HU-03: Filtrado Temporal por Ventana de Observación</w:t>
+              <w:t>[ESPECIFICACION] HU-03: Filtrado Temporal por Ventana de Observación</w:t>
               <w:br/>
             </w:r>
             <w:r>
@@ -5939,7 +5939,7 @@
                 <w:color w:val="006837"/>
                 <w:sz w:val="21"/>
               </w:rPr>
-              <w:t>📌 HU-04: Ingesta Masiva desde Múltiples Fuentes con Cola TDA</w:t>
+              <w:t>[ESPECIFICACION] HU-04: Ingesta Masiva desde Múltiples Fuentes con Cola TDA</w:t>
               <w:br/>
             </w:r>
             <w:r>
@@ -6011,7 +6011,7 @@
                 <w:color w:val="006837"/>
                 <w:sz w:val="21"/>
               </w:rPr>
-              <w:t>📌 HU-05: Reversión de Cambios con Pila LIFO (Undo)</w:t>
+              <w:t>[ESPECIFICACION] HU-05: Reversión de Cambios con Pila LIFO (Undo)</w:t>
               <w:br/>
             </w:r>
             <w:r>
@@ -6083,7 +6083,7 @@
                 <w:color w:val="ED1C24"/>
                 <w:sz w:val="21"/>
               </w:rPr>
-              <w:t>📌 HU-06: Dashboard Gráfico y Análisis Multivista (3 Vistas)</w:t>
+              <w:t>[ESPECIFICACION] HU-06: Dashboard Gráfico y Análisis Multivista (3 Vistas)</w:t>
               <w:br/>
             </w:r>
             <w:r>
@@ -7562,7 +7562,7 @@
                 <w:color w:val="ED1C24"/>
                 <w:sz w:val="21"/>
               </w:rPr>
-              <w:t>📌 Instrucciones Clave para Evaluación Rápida</w:t>
+              <w:t>[ESPECIFICACION] Instrucciones Clave para Evaluación Rápida</w:t>
               <w:br/>
             </w:r>
             <w:r>
@@ -7592,6 +7592,1346 @@
       <w:pPr>
         <w:spacing w:after="120"/>
       </w:pPr>
+    </w:p>
+    <w:p>
+      <w:r>
+        <w:br w:type="page"/>
+      </w:r>
+    </w:p>
+    <w:p>
+      <w:pPr>
+        <w:pStyle w:val="Heading1"/>
+        <w:spacing w:before="280" w:after="120"/>
+      </w:pPr>
+      <w:r>
+        <w:t>9. Catálogo Oficial MinCiencias 2024 (70 Subtipos) y Suite de Diagramas UML</w:t>
+      </w:r>
+    </w:p>
+    <w:p>
+      <w:r>
+        <w:t>El motor de clasificación de PEA-i incorpora el Anexo 1 completo de la Convocatoria Nacional 957 de MinCiencias (Documento Oficial M601PR04G01 v02), abarcando las 5 grandes familias de producción científica, 70 subtipos oficiales y 170 categorías de calidad con sus respectivos pesos relativos, pesos globales y clases de medición (TOP, A, B):</w:t>
+      </w:r>
+    </w:p>
+    <w:tbl>
+      <w:tblPr>
+        <w:tblW w:type="auto" w:w="0"/>
+        <w:jc w:val="center"/>
+        <w:tblLayout w:type="fixed"/>
+        <w:tblLook w:firstColumn="1" w:firstRow="1" w:lastColumn="0" w:lastRow="0" w:noHBand="0" w:noVBand="1" w:val="04A0"/>
+      </w:tblPr>
+      <w:tblGrid>
+        <w:gridCol w:w="2340"/>
+        <w:gridCol w:w="2340"/>
+        <w:gridCol w:w="2340"/>
+        <w:gridCol w:w="2340"/>
+      </w:tblGrid>
+      <w:tr>
+        <w:tc>
+          <w:tcPr>
+            <w:tcW w:type="dxa" w:w="1728"/>
+            <w:shd w:fill="006837"/>
+            <w:tcMar>
+              <w:top w:w="120" w:type="dxa"/>
+              <w:bottom w:w="120" w:type="dxa"/>
+              <w:left w:w="120" w:type="dxa"/>
+              <w:right w:w="120" w:type="dxa"/>
+            </w:tcMar>
+          </w:tcPr>
+          <w:p>
+            <w:pPr>
+              <w:spacing w:before="0" w:after="0"/>
+              <w:jc w:val="center"/>
+            </w:pPr>
+            <w:r>
+              <w:rPr>
+                <w:rFonts w:ascii="Segoe UI" w:hAnsi="Segoe UI"/>
+                <w:b/>
+                <w:color w:val="FFFFFF"/>
+                <w:sz w:val="18"/>
+              </w:rPr>
+              <w:t>Código Familia</w:t>
+            </w:r>
+          </w:p>
+        </w:tc>
+        <w:tc>
+          <w:tcPr>
+            <w:tcW w:type="dxa" w:w="4464"/>
+            <w:shd w:fill="006837"/>
+            <w:tcMar>
+              <w:top w:w="120" w:type="dxa"/>
+              <w:bottom w:w="120" w:type="dxa"/>
+              <w:left w:w="120" w:type="dxa"/>
+              <w:right w:w="120" w:type="dxa"/>
+            </w:tcMar>
+          </w:tcPr>
+          <w:p>
+            <w:pPr>
+              <w:spacing w:before="0" w:after="0"/>
+              <w:jc w:val="center"/>
+            </w:pPr>
+            <w:r>
+              <w:rPr>
+                <w:rFonts w:ascii="Segoe UI" w:hAnsi="Segoe UI"/>
+                <w:b/>
+                <w:color w:val="FFFFFF"/>
+                <w:sz w:val="18"/>
+              </w:rPr>
+              <w:t>Denominación Oficial MinCiencias 2024</w:t>
+            </w:r>
+          </w:p>
+        </w:tc>
+        <w:tc>
+          <w:tcPr>
+            <w:tcW w:type="dxa" w:w="1440"/>
+            <w:shd w:fill="006837"/>
+            <w:tcMar>
+              <w:top w:w="120" w:type="dxa"/>
+              <w:bottom w:w="120" w:type="dxa"/>
+              <w:left w:w="120" w:type="dxa"/>
+              <w:right w:w="120" w:type="dxa"/>
+            </w:tcMar>
+          </w:tcPr>
+          <w:p>
+            <w:pPr>
+              <w:spacing w:before="0" w:after="0"/>
+              <w:jc w:val="center"/>
+            </w:pPr>
+            <w:r>
+              <w:rPr>
+                <w:rFonts w:ascii="Segoe UI" w:hAnsi="Segoe UI"/>
+                <w:b/>
+                <w:color w:val="FFFFFF"/>
+                <w:sz w:val="18"/>
+              </w:rPr>
+              <w:t>Subtipos</w:t>
+            </w:r>
+          </w:p>
+        </w:tc>
+        <w:tc>
+          <w:tcPr>
+            <w:tcW w:type="dxa" w:w="1728"/>
+            <w:shd w:fill="006837"/>
+            <w:tcMar>
+              <w:top w:w="120" w:type="dxa"/>
+              <w:bottom w:w="120" w:type="dxa"/>
+              <w:left w:w="120" w:type="dxa"/>
+              <w:right w:w="120" w:type="dxa"/>
+            </w:tcMar>
+          </w:tcPr>
+          <w:p>
+            <w:pPr>
+              <w:spacing w:before="0" w:after="0"/>
+              <w:jc w:val="center"/>
+            </w:pPr>
+            <w:r>
+              <w:rPr>
+                <w:rFonts w:ascii="Segoe UI" w:hAnsi="Segoe UI"/>
+                <w:b/>
+                <w:color w:val="FFFFFF"/>
+                <w:sz w:val="18"/>
+              </w:rPr>
+              <w:t>Categorías Indexadas</w:t>
+            </w:r>
+          </w:p>
+        </w:tc>
+      </w:tr>
+      <w:tr>
+        <w:tc>
+          <w:tcPr>
+            <w:tcW w:type="dxa" w:w="1728"/>
+            <w:shd w:fill="FFFFFF"/>
+            <w:tcMar>
+              <w:top w:w="80" w:type="dxa"/>
+              <w:bottom w:w="80" w:type="dxa"/>
+              <w:left w:w="100" w:type="dxa"/>
+              <w:right w:w="100" w:type="dxa"/>
+            </w:tcMar>
+          </w:tcPr>
+          <w:p>
+            <w:pPr>
+              <w:spacing w:before="0" w:after="0"/>
+            </w:pPr>
+            <w:r>
+              <w:rPr>
+                <w:rFonts w:ascii="Segoe UI" w:hAnsi="Segoe UI"/>
+                <w:color w:val="1A202C"/>
+                <w:sz w:val="17"/>
+              </w:rPr>
+              <w:t>GNC</w:t>
+            </w:r>
+          </w:p>
+        </w:tc>
+        <w:tc>
+          <w:tcPr>
+            <w:tcW w:type="dxa" w:w="4464"/>
+            <w:shd w:fill="FFFFFF"/>
+            <w:tcMar>
+              <w:top w:w="80" w:type="dxa"/>
+              <w:bottom w:w="80" w:type="dxa"/>
+              <w:left w:w="100" w:type="dxa"/>
+              <w:right w:w="100" w:type="dxa"/>
+            </w:tcMar>
+          </w:tcPr>
+          <w:p>
+            <w:pPr>
+              <w:spacing w:before="0" w:after="0"/>
+            </w:pPr>
+            <w:r>
+              <w:rPr>
+                <w:rFonts w:ascii="Segoe UI" w:hAnsi="Segoe UI"/>
+                <w:color w:val="1A202C"/>
+                <w:sz w:val="17"/>
+              </w:rPr>
+              <w:t>Generación de Nuevo Conocimiento</w:t>
+            </w:r>
+          </w:p>
+        </w:tc>
+        <w:tc>
+          <w:tcPr>
+            <w:tcW w:type="dxa" w:w="1440"/>
+            <w:shd w:fill="FFFFFF"/>
+            <w:tcMar>
+              <w:top w:w="80" w:type="dxa"/>
+              <w:bottom w:w="80" w:type="dxa"/>
+              <w:left w:w="100" w:type="dxa"/>
+              <w:right w:w="100" w:type="dxa"/>
+            </w:tcMar>
+          </w:tcPr>
+          <w:p>
+            <w:pPr>
+              <w:spacing w:before="0" w:after="0"/>
+            </w:pPr>
+            <w:r>
+              <w:rPr>
+                <w:rFonts w:ascii="Segoe UI" w:hAnsi="Segoe UI"/>
+                <w:color w:val="1A202C"/>
+                <w:sz w:val="17"/>
+              </w:rPr>
+              <w:t>10</w:t>
+            </w:r>
+          </w:p>
+        </w:tc>
+        <w:tc>
+          <w:tcPr>
+            <w:tcW w:type="dxa" w:w="1728"/>
+            <w:shd w:fill="FFFFFF"/>
+            <w:tcMar>
+              <w:top w:w="80" w:type="dxa"/>
+              <w:bottom w:w="80" w:type="dxa"/>
+              <w:left w:w="100" w:type="dxa"/>
+              <w:right w:w="100" w:type="dxa"/>
+            </w:tcMar>
+          </w:tcPr>
+          <w:p>
+            <w:pPr>
+              <w:spacing w:before="0" w:after="0"/>
+            </w:pPr>
+            <w:r>
+              <w:rPr>
+                <w:rFonts w:ascii="Segoe UI" w:hAnsi="Segoe UI"/>
+                <w:color w:val="1A202C"/>
+                <w:sz w:val="17"/>
+              </w:rPr>
+              <w:t>57</w:t>
+            </w:r>
+          </w:p>
+        </w:tc>
+      </w:tr>
+      <w:tr>
+        <w:tc>
+          <w:tcPr>
+            <w:tcW w:type="dxa" w:w="1728"/>
+            <w:shd w:fill="F8F9FA"/>
+            <w:tcMar>
+              <w:top w:w="80" w:type="dxa"/>
+              <w:bottom w:w="80" w:type="dxa"/>
+              <w:left w:w="100" w:type="dxa"/>
+              <w:right w:w="100" w:type="dxa"/>
+            </w:tcMar>
+          </w:tcPr>
+          <w:p>
+            <w:pPr>
+              <w:spacing w:before="0" w:after="0"/>
+            </w:pPr>
+            <w:r>
+              <w:rPr>
+                <w:rFonts w:ascii="Segoe UI" w:hAnsi="Segoe UI"/>
+                <w:color w:val="1A202C"/>
+                <w:sz w:val="17"/>
+              </w:rPr>
+              <w:t>DTI</w:t>
+            </w:r>
+          </w:p>
+        </w:tc>
+        <w:tc>
+          <w:tcPr>
+            <w:tcW w:type="dxa" w:w="4464"/>
+            <w:shd w:fill="F8F9FA"/>
+            <w:tcMar>
+              <w:top w:w="80" w:type="dxa"/>
+              <w:bottom w:w="80" w:type="dxa"/>
+              <w:left w:w="100" w:type="dxa"/>
+              <w:right w:w="100" w:type="dxa"/>
+            </w:tcMar>
+          </w:tcPr>
+          <w:p>
+            <w:pPr>
+              <w:spacing w:before="0" w:after="0"/>
+            </w:pPr>
+            <w:r>
+              <w:rPr>
+                <w:rFonts w:ascii="Segoe UI" w:hAnsi="Segoe UI"/>
+                <w:color w:val="1A202C"/>
+                <w:sz w:val="17"/>
+              </w:rPr>
+              <w:t>Desarrollo Tecnológico e Innovación</w:t>
+            </w:r>
+          </w:p>
+        </w:tc>
+        <w:tc>
+          <w:tcPr>
+            <w:tcW w:type="dxa" w:w="1440"/>
+            <w:shd w:fill="F8F9FA"/>
+            <w:tcMar>
+              <w:top w:w="80" w:type="dxa"/>
+              <w:bottom w:w="80" w:type="dxa"/>
+              <w:left w:w="100" w:type="dxa"/>
+              <w:right w:w="100" w:type="dxa"/>
+            </w:tcMar>
+          </w:tcPr>
+          <w:p>
+            <w:pPr>
+              <w:spacing w:before="0" w:after="0"/>
+            </w:pPr>
+            <w:r>
+              <w:rPr>
+                <w:rFonts w:ascii="Segoe UI" w:hAnsi="Segoe UI"/>
+                <w:color w:val="1A202C"/>
+                <w:sz w:val="17"/>
+              </w:rPr>
+              <w:t>26</w:t>
+            </w:r>
+          </w:p>
+        </w:tc>
+        <w:tc>
+          <w:tcPr>
+            <w:tcW w:type="dxa" w:w="1728"/>
+            <w:shd w:fill="F8F9FA"/>
+            <w:tcMar>
+              <w:top w:w="80" w:type="dxa"/>
+              <w:bottom w:w="80" w:type="dxa"/>
+              <w:left w:w="100" w:type="dxa"/>
+              <w:right w:w="100" w:type="dxa"/>
+            </w:tcMar>
+          </w:tcPr>
+          <w:p>
+            <w:pPr>
+              <w:spacing w:before="0" w:after="0"/>
+            </w:pPr>
+            <w:r>
+              <w:rPr>
+                <w:rFonts w:ascii="Segoe UI" w:hAnsi="Segoe UI"/>
+                <w:color w:val="1A202C"/>
+                <w:sz w:val="17"/>
+              </w:rPr>
+              <w:t>34</w:t>
+            </w:r>
+          </w:p>
+        </w:tc>
+      </w:tr>
+      <w:tr>
+        <w:tc>
+          <w:tcPr>
+            <w:tcW w:type="dxa" w:w="1728"/>
+            <w:shd w:fill="FFFFFF"/>
+            <w:tcMar>
+              <w:top w:w="80" w:type="dxa"/>
+              <w:bottom w:w="80" w:type="dxa"/>
+              <w:left w:w="100" w:type="dxa"/>
+              <w:right w:w="100" w:type="dxa"/>
+            </w:tcMar>
+          </w:tcPr>
+          <w:p>
+            <w:pPr>
+              <w:spacing w:before="0" w:after="0"/>
+            </w:pPr>
+            <w:r>
+              <w:rPr>
+                <w:rFonts w:ascii="Segoe UI" w:hAnsi="Segoe UI"/>
+                <w:color w:val="1A202C"/>
+                <w:sz w:val="17"/>
+              </w:rPr>
+              <w:t>ASC</w:t>
+            </w:r>
+          </w:p>
+        </w:tc>
+        <w:tc>
+          <w:tcPr>
+            <w:tcW w:type="dxa" w:w="4464"/>
+            <w:shd w:fill="FFFFFF"/>
+            <w:tcMar>
+              <w:top w:w="80" w:type="dxa"/>
+              <w:bottom w:w="80" w:type="dxa"/>
+              <w:left w:w="100" w:type="dxa"/>
+              <w:right w:w="100" w:type="dxa"/>
+            </w:tcMar>
+          </w:tcPr>
+          <w:p>
+            <w:pPr>
+              <w:spacing w:before="0" w:after="0"/>
+            </w:pPr>
+            <w:r>
+              <w:rPr>
+                <w:rFonts w:ascii="Segoe UI" w:hAnsi="Segoe UI"/>
+                <w:color w:val="1A202C"/>
+                <w:sz w:val="17"/>
+              </w:rPr>
+              <w:t>Apropiación Social del Conocimiento</w:t>
+            </w:r>
+          </w:p>
+        </w:tc>
+        <w:tc>
+          <w:tcPr>
+            <w:tcW w:type="dxa" w:w="1440"/>
+            <w:shd w:fill="FFFFFF"/>
+            <w:tcMar>
+              <w:top w:w="80" w:type="dxa"/>
+              <w:bottom w:w="80" w:type="dxa"/>
+              <w:left w:w="100" w:type="dxa"/>
+              <w:right w:w="100" w:type="dxa"/>
+            </w:tcMar>
+          </w:tcPr>
+          <w:p>
+            <w:pPr>
+              <w:spacing w:before="0" w:after="0"/>
+            </w:pPr>
+            <w:r>
+              <w:rPr>
+                <w:rFonts w:ascii="Segoe UI" w:hAnsi="Segoe UI"/>
+                <w:color w:val="1A202C"/>
+                <w:sz w:val="17"/>
+              </w:rPr>
+              <w:t>4</w:t>
+            </w:r>
+          </w:p>
+        </w:tc>
+        <w:tc>
+          <w:tcPr>
+            <w:tcW w:type="dxa" w:w="1728"/>
+            <w:shd w:fill="FFFFFF"/>
+            <w:tcMar>
+              <w:top w:w="80" w:type="dxa"/>
+              <w:bottom w:w="80" w:type="dxa"/>
+              <w:left w:w="100" w:type="dxa"/>
+              <w:right w:w="100" w:type="dxa"/>
+            </w:tcMar>
+          </w:tcPr>
+          <w:p>
+            <w:pPr>
+              <w:spacing w:before="0" w:after="0"/>
+            </w:pPr>
+            <w:r>
+              <w:rPr>
+                <w:rFonts w:ascii="Segoe UI" w:hAnsi="Segoe UI"/>
+                <w:color w:val="1A202C"/>
+                <w:sz w:val="17"/>
+              </w:rPr>
+              <w:t>11</w:t>
+            </w:r>
+          </w:p>
+        </w:tc>
+      </w:tr>
+      <w:tr>
+        <w:tc>
+          <w:tcPr>
+            <w:tcW w:type="dxa" w:w="1728"/>
+            <w:shd w:fill="F8F9FA"/>
+            <w:tcMar>
+              <w:top w:w="80" w:type="dxa"/>
+              <w:bottom w:w="80" w:type="dxa"/>
+              <w:left w:w="100" w:type="dxa"/>
+              <w:right w:w="100" w:type="dxa"/>
+            </w:tcMar>
+          </w:tcPr>
+          <w:p>
+            <w:pPr>
+              <w:spacing w:before="0" w:after="0"/>
+            </w:pPr>
+            <w:r>
+              <w:rPr>
+                <w:rFonts w:ascii="Segoe UI" w:hAnsi="Segoe UI"/>
+                <w:color w:val="1A202C"/>
+                <w:sz w:val="17"/>
+              </w:rPr>
+              <w:t>DPC</w:t>
+            </w:r>
+          </w:p>
+        </w:tc>
+        <w:tc>
+          <w:tcPr>
+            <w:tcW w:type="dxa" w:w="4464"/>
+            <w:shd w:fill="F8F9FA"/>
+            <w:tcMar>
+              <w:top w:w="80" w:type="dxa"/>
+              <w:bottom w:w="80" w:type="dxa"/>
+              <w:left w:w="100" w:type="dxa"/>
+              <w:right w:w="100" w:type="dxa"/>
+            </w:tcMar>
+          </w:tcPr>
+          <w:p>
+            <w:pPr>
+              <w:spacing w:before="0" w:after="0"/>
+            </w:pPr>
+            <w:r>
+              <w:rPr>
+                <w:rFonts w:ascii="Segoe UI" w:hAnsi="Segoe UI"/>
+                <w:color w:val="1A202C"/>
+                <w:sz w:val="17"/>
+              </w:rPr>
+              <w:t>Divulgación Pública de la Ciencia</w:t>
+            </w:r>
+          </w:p>
+        </w:tc>
+        <w:tc>
+          <w:tcPr>
+            <w:tcW w:type="dxa" w:w="1440"/>
+            <w:shd w:fill="F8F9FA"/>
+            <w:tcMar>
+              <w:top w:w="80" w:type="dxa"/>
+              <w:bottom w:w="80" w:type="dxa"/>
+              <w:left w:w="100" w:type="dxa"/>
+              <w:right w:w="100" w:type="dxa"/>
+            </w:tcMar>
+          </w:tcPr>
+          <w:p>
+            <w:pPr>
+              <w:spacing w:before="0" w:after="0"/>
+            </w:pPr>
+            <w:r>
+              <w:rPr>
+                <w:rFonts w:ascii="Segoe UI" w:hAnsi="Segoe UI"/>
+                <w:color w:val="1A202C"/>
+                <w:sz w:val="17"/>
+              </w:rPr>
+              <w:t>21</w:t>
+            </w:r>
+          </w:p>
+        </w:tc>
+        <w:tc>
+          <w:tcPr>
+            <w:tcW w:type="dxa" w:w="1728"/>
+            <w:shd w:fill="F8F9FA"/>
+            <w:tcMar>
+              <w:top w:w="80" w:type="dxa"/>
+              <w:bottom w:w="80" w:type="dxa"/>
+              <w:left w:w="100" w:type="dxa"/>
+              <w:right w:w="100" w:type="dxa"/>
+            </w:tcMar>
+          </w:tcPr>
+          <w:p>
+            <w:pPr>
+              <w:spacing w:before="0" w:after="0"/>
+            </w:pPr>
+            <w:r>
+              <w:rPr>
+                <w:rFonts w:ascii="Segoe UI" w:hAnsi="Segoe UI"/>
+                <w:color w:val="1A202C"/>
+                <w:sz w:val="17"/>
+              </w:rPr>
+              <w:t>48</w:t>
+            </w:r>
+          </w:p>
+        </w:tc>
+      </w:tr>
+      <w:tr>
+        <w:tc>
+          <w:tcPr>
+            <w:tcW w:type="dxa" w:w="1728"/>
+            <w:shd w:fill="FFFFFF"/>
+            <w:tcMar>
+              <w:top w:w="80" w:type="dxa"/>
+              <w:bottom w:w="80" w:type="dxa"/>
+              <w:left w:w="100" w:type="dxa"/>
+              <w:right w:w="100" w:type="dxa"/>
+            </w:tcMar>
+          </w:tcPr>
+          <w:p>
+            <w:pPr>
+              <w:spacing w:before="0" w:after="0"/>
+            </w:pPr>
+            <w:r>
+              <w:rPr>
+                <w:rFonts w:ascii="Segoe UI" w:hAnsi="Segoe UI"/>
+                <w:color w:val="1A202C"/>
+                <w:sz w:val="17"/>
+              </w:rPr>
+              <w:t>FRH</w:t>
+            </w:r>
+          </w:p>
+        </w:tc>
+        <w:tc>
+          <w:tcPr>
+            <w:tcW w:type="dxa" w:w="4464"/>
+            <w:shd w:fill="FFFFFF"/>
+            <w:tcMar>
+              <w:top w:w="80" w:type="dxa"/>
+              <w:bottom w:w="80" w:type="dxa"/>
+              <w:left w:w="100" w:type="dxa"/>
+              <w:right w:w="100" w:type="dxa"/>
+            </w:tcMar>
+          </w:tcPr>
+          <w:p>
+            <w:pPr>
+              <w:spacing w:before="0" w:after="0"/>
+            </w:pPr>
+            <w:r>
+              <w:rPr>
+                <w:rFonts w:ascii="Segoe UI" w:hAnsi="Segoe UI"/>
+                <w:color w:val="1A202C"/>
+                <w:sz w:val="17"/>
+              </w:rPr>
+              <w:t>Formación de Recurso Humano para la CTeI</w:t>
+            </w:r>
+          </w:p>
+        </w:tc>
+        <w:tc>
+          <w:tcPr>
+            <w:tcW w:type="dxa" w:w="1440"/>
+            <w:shd w:fill="FFFFFF"/>
+            <w:tcMar>
+              <w:top w:w="80" w:type="dxa"/>
+              <w:bottom w:w="80" w:type="dxa"/>
+              <w:left w:w="100" w:type="dxa"/>
+              <w:right w:w="100" w:type="dxa"/>
+            </w:tcMar>
+          </w:tcPr>
+          <w:p>
+            <w:pPr>
+              <w:spacing w:before="0" w:after="0"/>
+            </w:pPr>
+            <w:r>
+              <w:rPr>
+                <w:rFonts w:ascii="Segoe UI" w:hAnsi="Segoe UI"/>
+                <w:color w:val="1A202C"/>
+                <w:sz w:val="17"/>
+              </w:rPr>
+              <w:t>9</w:t>
+            </w:r>
+          </w:p>
+        </w:tc>
+        <w:tc>
+          <w:tcPr>
+            <w:tcW w:type="dxa" w:w="1728"/>
+            <w:shd w:fill="FFFFFF"/>
+            <w:tcMar>
+              <w:top w:w="80" w:type="dxa"/>
+              <w:bottom w:w="80" w:type="dxa"/>
+              <w:left w:w="100" w:type="dxa"/>
+              <w:right w:w="100" w:type="dxa"/>
+            </w:tcMar>
+          </w:tcPr>
+          <w:p>
+            <w:pPr>
+              <w:spacing w:before="0" w:after="0"/>
+            </w:pPr>
+            <w:r>
+              <w:rPr>
+                <w:rFonts w:ascii="Segoe UI" w:hAnsi="Segoe UI"/>
+                <w:color w:val="1A202C"/>
+                <w:sz w:val="17"/>
+              </w:rPr>
+              <w:t>20</w:t>
+            </w:r>
+          </w:p>
+        </w:tc>
+      </w:tr>
+      <w:tr>
+        <w:tc>
+          <w:tcPr>
+            <w:tcW w:type="dxa" w:w="1728"/>
+            <w:shd w:fill="F8F9FA"/>
+            <w:tcMar>
+              <w:top w:w="80" w:type="dxa"/>
+              <w:bottom w:w="80" w:type="dxa"/>
+              <w:left w:w="100" w:type="dxa"/>
+              <w:right w:w="100" w:type="dxa"/>
+            </w:tcMar>
+          </w:tcPr>
+          <w:p>
+            <w:pPr>
+              <w:spacing w:before="0" w:after="0"/>
+            </w:pPr>
+            <w:r>
+              <w:rPr>
+                <w:rFonts w:ascii="Segoe UI" w:hAnsi="Segoe UI"/>
+                <w:color w:val="1A202C"/>
+                <w:sz w:val="17"/>
+              </w:rPr>
+              <w:t>TOTAL</w:t>
+            </w:r>
+          </w:p>
+        </w:tc>
+        <w:tc>
+          <w:tcPr>
+            <w:tcW w:type="dxa" w:w="4464"/>
+            <w:shd w:fill="F8F9FA"/>
+            <w:tcMar>
+              <w:top w:w="80" w:type="dxa"/>
+              <w:bottom w:w="80" w:type="dxa"/>
+              <w:left w:w="100" w:type="dxa"/>
+              <w:right w:w="100" w:type="dxa"/>
+            </w:tcMar>
+          </w:tcPr>
+          <w:p>
+            <w:pPr>
+              <w:spacing w:before="0" w:after="0"/>
+            </w:pPr>
+            <w:r>
+              <w:rPr>
+                <w:rFonts w:ascii="Segoe UI" w:hAnsi="Segoe UI"/>
+                <w:color w:val="1A202C"/>
+                <w:sz w:val="17"/>
+              </w:rPr>
+              <w:t>Cobertura Integral Anexo 1 (MinCiencias 2024)</w:t>
+            </w:r>
+          </w:p>
+        </w:tc>
+        <w:tc>
+          <w:tcPr>
+            <w:tcW w:type="dxa" w:w="1440"/>
+            <w:shd w:fill="F8F9FA"/>
+            <w:tcMar>
+              <w:top w:w="80" w:type="dxa"/>
+              <w:bottom w:w="80" w:type="dxa"/>
+              <w:left w:w="100" w:type="dxa"/>
+              <w:right w:w="100" w:type="dxa"/>
+            </w:tcMar>
+          </w:tcPr>
+          <w:p>
+            <w:pPr>
+              <w:spacing w:before="0" w:after="0"/>
+            </w:pPr>
+            <w:r>
+              <w:rPr>
+                <w:rFonts w:ascii="Segoe UI" w:hAnsi="Segoe UI"/>
+                <w:color w:val="1A202C"/>
+                <w:sz w:val="17"/>
+              </w:rPr>
+              <w:t>70</w:t>
+            </w:r>
+          </w:p>
+        </w:tc>
+        <w:tc>
+          <w:tcPr>
+            <w:tcW w:type="dxa" w:w="1728"/>
+            <w:shd w:fill="F8F9FA"/>
+            <w:tcMar>
+              <w:top w:w="80" w:type="dxa"/>
+              <w:bottom w:w="80" w:type="dxa"/>
+              <w:left w:w="100" w:type="dxa"/>
+              <w:right w:w="100" w:type="dxa"/>
+            </w:tcMar>
+          </w:tcPr>
+          <w:p>
+            <w:pPr>
+              <w:spacing w:before="0" w:after="0"/>
+            </w:pPr>
+            <w:r>
+              <w:rPr>
+                <w:rFonts w:ascii="Segoe UI" w:hAnsi="Segoe UI"/>
+                <w:color w:val="1A202C"/>
+                <w:sz w:val="17"/>
+              </w:rPr>
+              <w:t>170</w:t>
+            </w:r>
+          </w:p>
+        </w:tc>
+      </w:tr>
+    </w:tbl>
+    <w:p>
+      <w:pPr>
+        <w:spacing w:after="240"/>
+      </w:pPr>
+    </w:p>
+    <w:p>
+      <w:pPr>
+        <w:pStyle w:val="Heading2"/>
+      </w:pPr>
+      <w:r>
+        <w:t>9.1 Galería de Modelado Arquitectónico, Memoria RAM y Diagramas de Secuencia</w:t>
+      </w:r>
+    </w:p>
+    <w:p>
+      <w:pPr>
+        <w:jc w:val="center"/>
+      </w:pPr>
+      <w:r>
+        <w:drawing>
+          <wp:inline xmlns:a="http://schemas.openxmlformats.org/drawingml/2006/main" xmlns:pic="http://schemas.openxmlformats.org/drawingml/2006/picture">
+            <wp:extent cx="5486400" cy="475488"/>
+            <wp:docPr id="4" name="Picture 4"/>
+            <wp:cNvGraphicFramePr>
+              <a:graphicFrameLocks noChangeAspect="1"/>
+            </wp:cNvGraphicFramePr>
+            <a:graphic>
+              <a:graphicData uri="http://schemas.openxmlformats.org/drawingml/2006/picture">
+                <pic:pic>
+                  <pic:nvPicPr>
+                    <pic:cNvPr id="0" name="01_casos_de_uso.png"/>
+                    <pic:cNvPicPr/>
+                  </pic:nvPicPr>
+                  <pic:blipFill>
+                    <a:blip r:embed="rId12"/>
+                    <a:stretch>
+                      <a:fillRect/>
+                    </a:stretch>
+                  </pic:blipFill>
+                  <pic:spPr>
+                    <a:xfrm>
+                      <a:off x="0" y="0"/>
+                      <a:ext cx="5486400" cy="475488"/>
+                    </a:xfrm>
+                    <a:prstGeom prst="rect"/>
+                  </pic:spPr>
+                </pic:pic>
+              </a:graphicData>
+            </a:graphic>
+          </wp:inline>
+        </w:drawing>
+      </w:r>
+    </w:p>
+    <w:p>
+      <w:pPr>
+        <w:spacing w:after="200"/>
+        <w:jc w:val="center"/>
+      </w:pPr>
+      <w:r>
+        <w:rPr>
+          <w:i/>
+          <w:sz w:val="17"/>
+        </w:rPr>
+        <w:t>Diagrama 01: Casos de Uso Generales del Sistema PEA-i.</w:t>
+      </w:r>
+    </w:p>
+    <w:p>
+      <w:pPr>
+        <w:jc w:val="center"/>
+      </w:pPr>
+      <w:r>
+        <w:drawing>
+          <wp:inline xmlns:a="http://schemas.openxmlformats.org/drawingml/2006/main" xmlns:pic="http://schemas.openxmlformats.org/drawingml/2006/picture">
+            <wp:extent cx="5486400" cy="3858768"/>
+            <wp:docPr id="5" name="Picture 5"/>
+            <wp:cNvGraphicFramePr>
+              <a:graphicFrameLocks noChangeAspect="1"/>
+            </wp:cNvGraphicFramePr>
+            <a:graphic>
+              <a:graphicData uri="http://schemas.openxmlformats.org/drawingml/2006/picture">
+                <pic:pic>
+                  <pic:nvPicPr>
+                    <pic:cNvPr id="0" name="02_modelo_entidad_relacion.png"/>
+                    <pic:cNvPicPr/>
+                  </pic:nvPicPr>
+                  <pic:blipFill>
+                    <a:blip r:embed="rId13"/>
+                    <a:stretch>
+                      <a:fillRect/>
+                    </a:stretch>
+                  </pic:blipFill>
+                  <pic:spPr>
+                    <a:xfrm>
+                      <a:off x="0" y="0"/>
+                      <a:ext cx="5486400" cy="3858768"/>
+                    </a:xfrm>
+                    <a:prstGeom prst="rect"/>
+                  </pic:spPr>
+                </pic:pic>
+              </a:graphicData>
+            </a:graphic>
+          </wp:inline>
+        </w:drawing>
+      </w:r>
+    </w:p>
+    <w:p>
+      <w:pPr>
+        <w:spacing w:after="200"/>
+        <w:jc w:val="center"/>
+      </w:pPr>
+      <w:r>
+        <w:rPr>
+          <w:i/>
+          <w:sz w:val="17"/>
+        </w:rPr>
+        <w:t>Diagrama 02: Modelo Entidad-Relación y Persistencia Relacional.</w:t>
+      </w:r>
+    </w:p>
+    <w:p>
+      <w:pPr>
+        <w:jc w:val="center"/>
+      </w:pPr>
+      <w:r>
+        <w:drawing>
+          <wp:inline xmlns:a="http://schemas.openxmlformats.org/drawingml/2006/main" xmlns:pic="http://schemas.openxmlformats.org/drawingml/2006/picture">
+            <wp:extent cx="5486400" cy="1408176"/>
+            <wp:docPr id="6" name="Picture 6"/>
+            <wp:cNvGraphicFramePr>
+              <a:graphicFrameLocks noChangeAspect="1"/>
+            </wp:cNvGraphicFramePr>
+            <a:graphic>
+              <a:graphicData uri="http://schemas.openxmlformats.org/drawingml/2006/picture">
+                <pic:pic>
+                  <pic:nvPicPr>
+                    <pic:cNvPr id="0" name="03_multilista_memoria_ram.png"/>
+                    <pic:cNvPicPr/>
+                  </pic:nvPicPr>
+                  <pic:blipFill>
+                    <a:blip r:embed="rId14"/>
+                    <a:stretch>
+                      <a:fillRect/>
+                    </a:stretch>
+                  </pic:blipFill>
+                  <pic:spPr>
+                    <a:xfrm>
+                      <a:off x="0" y="0"/>
+                      <a:ext cx="5486400" cy="1408176"/>
+                    </a:xfrm>
+                    <a:prstGeom prst="rect"/>
+                  </pic:spPr>
+                </pic:pic>
+              </a:graphicData>
+            </a:graphic>
+          </wp:inline>
+        </w:drawing>
+      </w:r>
+    </w:p>
+    <w:p>
+      <w:pPr>
+        <w:spacing w:after="200"/>
+        <w:jc w:val="center"/>
+      </w:pPr>
+      <w:r>
+        <w:rPr>
+          <w:i/>
+          <w:sz w:val="17"/>
+        </w:rPr>
+        <w:t>Diagrama 03: Topología de la Multilista Ortogonal 3D y Nodos en Memoria RAM.</w:t>
+      </w:r>
+    </w:p>
+    <w:p>
+      <w:pPr>
+        <w:jc w:val="center"/>
+      </w:pPr>
+      <w:r>
+        <w:drawing>
+          <wp:inline xmlns:a="http://schemas.openxmlformats.org/drawingml/2006/main" xmlns:pic="http://schemas.openxmlformats.org/drawingml/2006/picture">
+            <wp:extent cx="5486400" cy="2560320"/>
+            <wp:docPr id="7" name="Picture 7"/>
+            <wp:cNvGraphicFramePr>
+              <a:graphicFrameLocks noChangeAspect="1"/>
+            </wp:cNvGraphicFramePr>
+            <a:graphic>
+              <a:graphicData uri="http://schemas.openxmlformats.org/drawingml/2006/picture">
+                <pic:pic>
+                  <pic:nvPicPr>
+                    <pic:cNvPr id="0" name="04_clases_cpp.png"/>
+                    <pic:cNvPicPr/>
+                  </pic:nvPicPr>
+                  <pic:blipFill>
+                    <a:blip r:embed="rId15"/>
+                    <a:stretch>
+                      <a:fillRect/>
+                    </a:stretch>
+                  </pic:blipFill>
+                  <pic:spPr>
+                    <a:xfrm>
+                      <a:off x="0" y="0"/>
+                      <a:ext cx="5486400" cy="2560320"/>
+                    </a:xfrm>
+                    <a:prstGeom prst="rect"/>
+                  </pic:spPr>
+                </pic:pic>
+              </a:graphicData>
+            </a:graphic>
+          </wp:inline>
+        </w:drawing>
+      </w:r>
+    </w:p>
+    <w:p>
+      <w:pPr>
+        <w:spacing w:after="200"/>
+        <w:jc w:val="center"/>
+      </w:pPr>
+      <w:r>
+        <w:rPr>
+          <w:i/>
+          <w:sz w:val="17"/>
+        </w:rPr>
+        <w:t>Diagrama 04: Diagrama de Clases y Estructuras TDA en C++17.</w:t>
+      </w:r>
+    </w:p>
+    <w:p>
+      <w:pPr>
+        <w:jc w:val="center"/>
+      </w:pPr>
+      <w:r>
+        <w:drawing>
+          <wp:inline xmlns:a="http://schemas.openxmlformats.org/drawingml/2006/main" xmlns:pic="http://schemas.openxmlformats.org/drawingml/2006/picture">
+            <wp:extent cx="5486400" cy="694944"/>
+            <wp:docPr id="8" name="Picture 8"/>
+            <wp:cNvGraphicFramePr>
+              <a:graphicFrameLocks noChangeAspect="1"/>
+            </wp:cNvGraphicFramePr>
+            <a:graphic>
+              <a:graphicData uri="http://schemas.openxmlformats.org/drawingml/2006/picture">
+                <pic:pic>
+                  <pic:nvPicPr>
+                    <pic:cNvPr id="0" name="05_hipercubo_informacion.png"/>
+                    <pic:cNvPicPr/>
+                  </pic:nvPicPr>
+                  <pic:blipFill>
+                    <a:blip r:embed="rId16"/>
+                    <a:stretch>
+                      <a:fillRect/>
+                    </a:stretch>
+                  </pic:blipFill>
+                  <pic:spPr>
+                    <a:xfrm>
+                      <a:off x="0" y="0"/>
+                      <a:ext cx="5486400" cy="694944"/>
+                    </a:xfrm>
+                    <a:prstGeom prst="rect"/>
+                  </pic:spPr>
+                </pic:pic>
+              </a:graphicData>
+            </a:graphic>
+          </wp:inline>
+        </w:drawing>
+      </w:r>
+    </w:p>
+    <w:p>
+      <w:pPr>
+        <w:spacing w:after="200"/>
+        <w:jc w:val="center"/>
+      </w:pPr>
+      <w:r>
+        <w:rPr>
+          <w:i/>
+          <w:sz w:val="17"/>
+        </w:rPr>
+        <w:t>Diagrama 05: Hipercubo de Información Multidimensional (Cortes OLAP).</w:t>
+      </w:r>
+    </w:p>
+    <w:p>
+      <w:pPr>
+        <w:jc w:val="center"/>
+      </w:pPr>
+      <w:r>
+        <w:drawing>
+          <wp:inline xmlns:a="http://schemas.openxmlformats.org/drawingml/2006/main" xmlns:pic="http://schemas.openxmlformats.org/drawingml/2006/picture">
+            <wp:extent cx="5486400" cy="2084832"/>
+            <wp:docPr id="9" name="Picture 9"/>
+            <wp:cNvGraphicFramePr>
+              <a:graphicFrameLocks noChangeAspect="1"/>
+            </wp:cNvGraphicFramePr>
+            <a:graphic>
+              <a:graphicData uri="http://schemas.openxmlformats.org/drawingml/2006/picture">
+                <pic:pic>
+                  <pic:nvPicPr>
+                    <pic:cNvPr id="0" name="06_secuencia_creacion_escritura_dual.png"/>
+                    <pic:cNvPicPr/>
+                  </pic:nvPicPr>
+                  <pic:blipFill>
+                    <a:blip r:embed="rId17"/>
+                    <a:stretch>
+                      <a:fillRect/>
+                    </a:stretch>
+                  </pic:blipFill>
+                  <pic:spPr>
+                    <a:xfrm>
+                      <a:off x="0" y="0"/>
+                      <a:ext cx="5486400" cy="2084832"/>
+                    </a:xfrm>
+                    <a:prstGeom prst="rect"/>
+                  </pic:spPr>
+                </pic:pic>
+              </a:graphicData>
+            </a:graphic>
+          </wp:inline>
+        </w:drawing>
+      </w:r>
+    </w:p>
+    <w:p>
+      <w:pPr>
+        <w:spacing w:after="200"/>
+        <w:jc w:val="center"/>
+      </w:pPr>
+      <w:r>
+        <w:rPr>
+          <w:i/>
+          <w:sz w:val="17"/>
+        </w:rPr>
+        <w:t>Diagrama 06: Secuencia de Creación con Escritura Dual (RAM + SQLite3).</w:t>
+      </w:r>
+    </w:p>
+    <w:p>
+      <w:pPr>
+        <w:jc w:val="center"/>
+      </w:pPr>
+      <w:r>
+        <w:drawing>
+          <wp:inline xmlns:a="http://schemas.openxmlformats.org/drawingml/2006/main" xmlns:pic="http://schemas.openxmlformats.org/drawingml/2006/picture">
+            <wp:extent cx="5486400" cy="2761488"/>
+            <wp:docPr id="10" name="Picture 10"/>
+            <wp:cNvGraphicFramePr>
+              <a:graphicFrameLocks noChangeAspect="1"/>
+            </wp:cNvGraphicFramePr>
+            <a:graphic>
+              <a:graphicData uri="http://schemas.openxmlformats.org/drawingml/2006/picture">
+                <pic:pic>
+                  <pic:nvPicPr>
+                    <pic:cNvPr id="0" name="07_secuencia_ingesta_scienti.png"/>
+                    <pic:cNvPicPr/>
+                  </pic:nvPicPr>
+                  <pic:blipFill>
+                    <a:blip r:embed="rId18"/>
+                    <a:stretch>
+                      <a:fillRect/>
+                    </a:stretch>
+                  </pic:blipFill>
+                  <pic:spPr>
+                    <a:xfrm>
+                      <a:off x="0" y="0"/>
+                      <a:ext cx="5486400" cy="2761488"/>
+                    </a:xfrm>
+                    <a:prstGeom prst="rect"/>
+                  </pic:spPr>
+                </pic:pic>
+              </a:graphicData>
+            </a:graphic>
+          </wp:inline>
+        </w:drawing>
+      </w:r>
+    </w:p>
+    <w:p>
+      <w:pPr>
+        <w:spacing w:after="200"/>
+        <w:jc w:val="center"/>
+      </w:pPr>
+      <w:r>
+        <w:rPr>
+          <w:i/>
+          <w:sz w:val="17"/>
+        </w:rPr>
+        <w:t>Diagrama 07: Secuencia de Ingesta Scienti (GrupLAC / CvLAC / Datos Abiertos) y Deduplicación.</w:t>
+      </w:r>
+    </w:p>
+    <w:p>
+      <w:pPr>
+        <w:jc w:val="center"/>
+      </w:pPr>
+      <w:r>
+        <w:drawing>
+          <wp:inline xmlns:a="http://schemas.openxmlformats.org/drawingml/2006/main" xmlns:pic="http://schemas.openxmlformats.org/drawingml/2006/picture">
+            <wp:extent cx="5486400" cy="3108960"/>
+            <wp:docPr id="11" name="Picture 11"/>
+            <wp:cNvGraphicFramePr>
+              <a:graphicFrameLocks noChangeAspect="1"/>
+            </wp:cNvGraphicFramePr>
+            <a:graphic>
+              <a:graphicData uri="http://schemas.openxmlformats.org/drawingml/2006/picture">
+                <pic:pic>
+                  <pic:nvPicPr>
+                    <pic:cNvPr id="0" name="08_secuencia_membresias_reglas.png"/>
+                    <pic:cNvPicPr/>
+                  </pic:nvPicPr>
+                  <pic:blipFill>
+                    <a:blip r:embed="rId19"/>
+                    <a:stretch>
+                      <a:fillRect/>
+                    </a:stretch>
+                  </pic:blipFill>
+                  <pic:spPr>
+                    <a:xfrm>
+                      <a:off x="0" y="0"/>
+                      <a:ext cx="5486400" cy="3108960"/>
+                    </a:xfrm>
+                    <a:prstGeom prst="rect"/>
+                  </pic:spPr>
+                </pic:pic>
+              </a:graphicData>
+            </a:graphic>
+          </wp:inline>
+        </w:drawing>
+      </w:r>
+    </w:p>
+    <w:p>
+      <w:pPr>
+        <w:spacing w:after="200"/>
+        <w:jc w:val="center"/>
+      </w:pPr>
+      <w:r>
+        <w:rPr>
+          <w:i/>
+          <w:sz w:val="17"/>
+        </w:rPr>
+        <w:t>Diagrama 08: Secuencia de Atribución de Membresías y Reglas de Integridad.</w:t>
+      </w:r>
+    </w:p>
+    <w:p>
+      <w:pPr>
+        <w:jc w:val="center"/>
+      </w:pPr>
+      <w:r>
+        <w:drawing>
+          <wp:inline xmlns:a="http://schemas.openxmlformats.org/drawingml/2006/main" xmlns:pic="http://schemas.openxmlformats.org/drawingml/2006/picture">
+            <wp:extent cx="5486400" cy="2871215"/>
+            <wp:docPr id="12" name="Picture 12"/>
+            <wp:cNvGraphicFramePr>
+              <a:graphicFrameLocks noChangeAspect="1"/>
+            </wp:cNvGraphicFramePr>
+            <a:graphic>
+              <a:graphicData uri="http://schemas.openxmlformats.org/drawingml/2006/picture">
+                <pic:pic>
+                  <pic:nvPicPr>
+                    <pic:cNvPr id="0" name="09_secuencia_validacion_fifo.png"/>
+                    <pic:cNvPicPr/>
+                  </pic:nvPicPr>
+                  <pic:blipFill>
+                    <a:blip r:embed="rId20"/>
+                    <a:stretch>
+                      <a:fillRect/>
+                    </a:stretch>
+                  </pic:blipFill>
+                  <pic:spPr>
+                    <a:xfrm>
+                      <a:off x="0" y="0"/>
+                      <a:ext cx="5486400" cy="2871215"/>
+                    </a:xfrm>
+                    <a:prstGeom prst="rect"/>
+                  </pic:spPr>
+                </pic:pic>
+              </a:graphicData>
+            </a:graphic>
+          </wp:inline>
+        </w:drawing>
+      </w:r>
+    </w:p>
+    <w:p>
+      <w:pPr>
+        <w:spacing w:after="200"/>
+        <w:jc w:val="center"/>
+      </w:pPr>
+      <w:r>
+        <w:rPr>
+          <w:i/>
+          <w:sz w:val="17"/>
+        </w:rPr>
+        <w:t>Diagrama 09: Secuencia de Procesamiento FIFO en la Cola de Ingesta/Validación.</w:t>
+      </w:r>
+    </w:p>
+    <w:p>
+      <w:pPr>
+        <w:jc w:val="center"/>
+      </w:pPr>
+      <w:r>
+        <w:drawing>
+          <wp:inline xmlns:a="http://schemas.openxmlformats.org/drawingml/2006/main" xmlns:pic="http://schemas.openxmlformats.org/drawingml/2006/picture">
+            <wp:extent cx="5486400" cy="3511296"/>
+            <wp:docPr id="13" name="Picture 13"/>
+            <wp:cNvGraphicFramePr>
+              <a:graphicFrameLocks noChangeAspect="1"/>
+            </wp:cNvGraphicFramePr>
+            <a:graphic>
+              <a:graphicData uri="http://schemas.openxmlformats.org/drawingml/2006/picture">
+                <pic:pic>
+                  <pic:nvPicPr>
+                    <pic:cNvPr id="0" name="10_secuencia_deshacer_lifo.png"/>
+                    <pic:cNvPicPr/>
+                  </pic:nvPicPr>
+                  <pic:blipFill>
+                    <a:blip r:embed="rId21"/>
+                    <a:stretch>
+                      <a:fillRect/>
+                    </a:stretch>
+                  </pic:blipFill>
+                  <pic:spPr>
+                    <a:xfrm>
+                      <a:off x="0" y="0"/>
+                      <a:ext cx="5486400" cy="3511296"/>
+                    </a:xfrm>
+                    <a:prstGeom prst="rect"/>
+                  </pic:spPr>
+                </pic:pic>
+              </a:graphicData>
+            </a:graphic>
+          </wp:inline>
+        </w:drawing>
+      </w:r>
+    </w:p>
+    <w:p>
+      <w:pPr>
+        <w:spacing w:after="200"/>
+        <w:jc w:val="center"/>
+      </w:pPr>
+      <w:r>
+        <w:rPr>
+          <w:i/>
+          <w:sz w:val="17"/>
+        </w:rPr>
+        <w:t>Diagrama 10: Secuencia de Reversión Transaccional LIFO en la Pila de Operaciones (Undo).</w:t>
+      </w:r>
+    </w:p>
+    <w:p>
+      <w:pPr>
+        <w:jc w:val="center"/>
+      </w:pPr>
+      <w:r>
+        <w:drawing>
+          <wp:inline xmlns:a="http://schemas.openxmlformats.org/drawingml/2006/main" xmlns:pic="http://schemas.openxmlformats.org/drawingml/2006/picture">
+            <wp:extent cx="5486400" cy="2615184"/>
+            <wp:docPr id="14" name="Picture 14"/>
+            <wp:cNvGraphicFramePr>
+              <a:graphicFrameLocks noChangeAspect="1"/>
+            </wp:cNvGraphicFramePr>
+            <a:graphic>
+              <a:graphicData uri="http://schemas.openxmlformats.org/drawingml/2006/picture">
+                <pic:pic>
+                  <pic:nvPicPr>
+                    <pic:cNvPr id="0" name="11_arquitectura_despliegue.png"/>
+                    <pic:cNvPicPr/>
+                  </pic:nvPicPr>
+                  <pic:blipFill>
+                    <a:blip r:embed="rId22"/>
+                    <a:stretch>
+                      <a:fillRect/>
+                    </a:stretch>
+                  </pic:blipFill>
+                  <pic:spPr>
+                    <a:xfrm>
+                      <a:off x="0" y="0"/>
+                      <a:ext cx="5486400" cy="2615184"/>
+                    </a:xfrm>
+                    <a:prstGeom prst="rect"/>
+                  </pic:spPr>
+                </pic:pic>
+              </a:graphicData>
+            </a:graphic>
+          </wp:inline>
+        </w:drawing>
+      </w:r>
+    </w:p>
+    <w:p>
+      <w:pPr>
+        <w:spacing w:after="200"/>
+        <w:jc w:val="center"/>
+      </w:pPr>
+      <w:r>
+        <w:rPr>
+          <w:i/>
+          <w:sz w:val="17"/>
+        </w:rPr>
+        <w:t>Diagrama 11: Arquitectura Física de Integración Políglota (C++17, Python y SQLite3).</w:t>
+      </w:r>
     </w:p>
     <w:sectPr>
       <w:pgSz w:w="12240" w:h="15840"/>

</xml_diff>

<commit_message>
feat(branding): incorporar logo oficial de la Universidad Popular del Cesar (UPC) en GUI, Portal Web, PDF y Word
</commit_message>
<xml_diff>
--- a/Documentacion_Tecnica_GrupoXX.docx
+++ b/Documentacion_Tecnica_GrupoXX.docx
@@ -2,6 +2,46 @@
 <file path=word/document.xml><?xml version="1.0" encoding="utf-8"?>
 <w:document xmlns:wpc="http://schemas.microsoft.com/office/word/2010/wordprocessingCanvas" xmlns:mo="http://schemas.microsoft.com/office/mac/office/2008/main" xmlns:mc="http://schemas.openxmlformats.org/markup-compatibility/2006" xmlns:mv="urn:schemas-microsoft-com:mac:vml" xmlns:o="urn:schemas-microsoft-com:office:office" xmlns:r="http://schemas.openxmlformats.org/officeDocument/2006/relationships" xmlns:m="http://schemas.openxmlformats.org/officeDocument/2006/math" xmlns:v="urn:schemas-microsoft-com:vml" xmlns:wp14="http://schemas.microsoft.com/office/word/2010/wordprocessingDrawing" xmlns:wp="http://schemas.openxmlformats.org/drawingml/2006/wordprocessingDrawing" xmlns:w10="urn:schemas-microsoft-com:office:word" xmlns:w="http://schemas.openxmlformats.org/wordprocessingml/2006/main" xmlns:w14="http://schemas.microsoft.com/office/word/2010/wordml" xmlns:wpg="http://schemas.microsoft.com/office/word/2010/wordprocessingGroup" xmlns:wpi="http://schemas.microsoft.com/office/word/2010/wordprocessingInk" xmlns:wne="http://schemas.microsoft.com/office/word/2006/wordml" xmlns:wps="http://schemas.microsoft.com/office/word/2010/wordprocessingShape" mc:Ignorable="w14 wp14">
   <w:body>
+    <w:p>
+      <w:pPr>
+        <w:spacing w:after="200"/>
+        <w:jc w:val="center"/>
+      </w:pPr>
+      <w:r>
+        <w:drawing>
+          <wp:inline xmlns:a="http://schemas.openxmlformats.org/drawingml/2006/main" xmlns:pic="http://schemas.openxmlformats.org/drawingml/2006/picture">
+            <wp:extent cx="1691640" cy="1475486"/>
+            <wp:docPr id="1" name="Picture 1"/>
+            <wp:cNvGraphicFramePr>
+              <a:graphicFrameLocks noChangeAspect="1"/>
+            </wp:cNvGraphicFramePr>
+            <a:graphic>
+              <a:graphicData uri="http://schemas.openxmlformats.org/drawingml/2006/picture">
+                <pic:pic>
+                  <pic:nvPicPr>
+                    <pic:cNvPr id="0" name="logo_upc.png"/>
+                    <pic:cNvPicPr/>
+                  </pic:nvPicPr>
+                  <pic:blipFill>
+                    <a:blip r:embed="rId9"/>
+                    <a:stretch>
+                      <a:fillRect/>
+                    </a:stretch>
+                  </pic:blipFill>
+                  <pic:spPr>
+                    <a:xfrm>
+                      <a:off x="0" y="0"/>
+                      <a:ext cx="1691640" cy="1475486"/>
+                    </a:xfrm>
+                    <a:prstGeom prst="rect"/>
+                  </pic:spPr>
+                </pic:pic>
+              </a:graphicData>
+            </a:graphic>
+          </wp:inline>
+        </w:drawing>
+      </w:r>
+    </w:p>
     <w:p>
       <w:pPr>
         <w:jc w:val="center"/>
@@ -4584,7 +4624,7 @@
         <w:drawing>
           <wp:inline xmlns:a="http://schemas.openxmlformats.org/drawingml/2006/main" xmlns:pic="http://schemas.openxmlformats.org/drawingml/2006/picture">
             <wp:extent cx="5669280" cy="3478626"/>
-            <wp:docPr id="1" name="Picture 1"/>
+            <wp:docPr id="2" name="Picture 2"/>
             <wp:cNvGraphicFramePr>
               <a:graphicFrameLocks noChangeAspect="1"/>
             </wp:cNvGraphicFramePr>
@@ -4596,7 +4636,7 @@
                     <pic:cNvPicPr/>
                   </pic:nvPicPr>
                   <pic:blipFill>
-                    <a:blip r:embed="rId9"/>
+                    <a:blip r:embed="rId10"/>
                     <a:stretch>
                       <a:fillRect/>
                     </a:stretch>
@@ -5623,7 +5663,7 @@
         <w:drawing>
           <wp:inline xmlns:a="http://schemas.openxmlformats.org/drawingml/2006/main" xmlns:pic="http://schemas.openxmlformats.org/drawingml/2006/picture">
             <wp:extent cx="5486400" cy="3704473"/>
-            <wp:docPr id="2" name="Picture 2"/>
+            <wp:docPr id="3" name="Picture 3"/>
             <wp:cNvGraphicFramePr>
               <a:graphicFrameLocks noChangeAspect="1"/>
             </wp:cNvGraphicFramePr>
@@ -5635,7 +5675,7 @@
                     <pic:cNvPicPr/>
                   </pic:nvPicPr>
                   <pic:blipFill>
-                    <a:blip r:embed="rId10"/>
+                    <a:blip r:embed="rId11"/>
                     <a:stretch>
                       <a:fillRect/>
                     </a:stretch>
@@ -6140,7 +6180,7 @@
         <w:drawing>
           <wp:inline xmlns:a="http://schemas.openxmlformats.org/drawingml/2006/main" xmlns:pic="http://schemas.openxmlformats.org/drawingml/2006/picture">
             <wp:extent cx="5669280" cy="3525435"/>
-            <wp:docPr id="3" name="Picture 3"/>
+            <wp:docPr id="4" name="Picture 4"/>
             <wp:cNvGraphicFramePr>
               <a:graphicFrameLocks noChangeAspect="1"/>
             </wp:cNvGraphicFramePr>
@@ -6152,7 +6192,7 @@
                     <pic:cNvPicPr/>
                   </pic:nvPicPr>
                   <pic:blipFill>
-                    <a:blip r:embed="rId11"/>
+                    <a:blip r:embed="rId12"/>
                     <a:stretch>
                       <a:fillRect/>
                     </a:stretch>
@@ -8369,7 +8409,7 @@
         <w:drawing>
           <wp:inline xmlns:a="http://schemas.openxmlformats.org/drawingml/2006/main" xmlns:pic="http://schemas.openxmlformats.org/drawingml/2006/picture">
             <wp:extent cx="5486400" cy="475488"/>
-            <wp:docPr id="4" name="Picture 4"/>
+            <wp:docPr id="5" name="Picture 5"/>
             <wp:cNvGraphicFramePr>
               <a:graphicFrameLocks noChangeAspect="1"/>
             </wp:cNvGraphicFramePr>
@@ -8381,7 +8421,7 @@
                     <pic:cNvPicPr/>
                   </pic:nvPicPr>
                   <pic:blipFill>
-                    <a:blip r:embed="rId12"/>
+                    <a:blip r:embed="rId13"/>
                     <a:stretch>
                       <a:fillRect/>
                     </a:stretch>
@@ -8421,7 +8461,7 @@
         <w:drawing>
           <wp:inline xmlns:a="http://schemas.openxmlformats.org/drawingml/2006/main" xmlns:pic="http://schemas.openxmlformats.org/drawingml/2006/picture">
             <wp:extent cx="5486400" cy="3858768"/>
-            <wp:docPr id="5" name="Picture 5"/>
+            <wp:docPr id="6" name="Picture 6"/>
             <wp:cNvGraphicFramePr>
               <a:graphicFrameLocks noChangeAspect="1"/>
             </wp:cNvGraphicFramePr>
@@ -8433,7 +8473,7 @@
                     <pic:cNvPicPr/>
                   </pic:nvPicPr>
                   <pic:blipFill>
-                    <a:blip r:embed="rId13"/>
+                    <a:blip r:embed="rId14"/>
                     <a:stretch>
                       <a:fillRect/>
                     </a:stretch>
@@ -8473,7 +8513,7 @@
         <w:drawing>
           <wp:inline xmlns:a="http://schemas.openxmlformats.org/drawingml/2006/main" xmlns:pic="http://schemas.openxmlformats.org/drawingml/2006/picture">
             <wp:extent cx="5486400" cy="1408176"/>
-            <wp:docPr id="6" name="Picture 6"/>
+            <wp:docPr id="7" name="Picture 7"/>
             <wp:cNvGraphicFramePr>
               <a:graphicFrameLocks noChangeAspect="1"/>
             </wp:cNvGraphicFramePr>
@@ -8485,7 +8525,7 @@
                     <pic:cNvPicPr/>
                   </pic:nvPicPr>
                   <pic:blipFill>
-                    <a:blip r:embed="rId14"/>
+                    <a:blip r:embed="rId15"/>
                     <a:stretch>
                       <a:fillRect/>
                     </a:stretch>
@@ -8525,7 +8565,7 @@
         <w:drawing>
           <wp:inline xmlns:a="http://schemas.openxmlformats.org/drawingml/2006/main" xmlns:pic="http://schemas.openxmlformats.org/drawingml/2006/picture">
             <wp:extent cx="5486400" cy="2560320"/>
-            <wp:docPr id="7" name="Picture 7"/>
+            <wp:docPr id="8" name="Picture 8"/>
             <wp:cNvGraphicFramePr>
               <a:graphicFrameLocks noChangeAspect="1"/>
             </wp:cNvGraphicFramePr>
@@ -8537,7 +8577,7 @@
                     <pic:cNvPicPr/>
                   </pic:nvPicPr>
                   <pic:blipFill>
-                    <a:blip r:embed="rId15"/>
+                    <a:blip r:embed="rId16"/>
                     <a:stretch>
                       <a:fillRect/>
                     </a:stretch>
@@ -8577,7 +8617,7 @@
         <w:drawing>
           <wp:inline xmlns:a="http://schemas.openxmlformats.org/drawingml/2006/main" xmlns:pic="http://schemas.openxmlformats.org/drawingml/2006/picture">
             <wp:extent cx="5486400" cy="694944"/>
-            <wp:docPr id="8" name="Picture 8"/>
+            <wp:docPr id="9" name="Picture 9"/>
             <wp:cNvGraphicFramePr>
               <a:graphicFrameLocks noChangeAspect="1"/>
             </wp:cNvGraphicFramePr>
@@ -8589,7 +8629,7 @@
                     <pic:cNvPicPr/>
                   </pic:nvPicPr>
                   <pic:blipFill>
-                    <a:blip r:embed="rId16"/>
+                    <a:blip r:embed="rId17"/>
                     <a:stretch>
                       <a:fillRect/>
                     </a:stretch>
@@ -8629,7 +8669,7 @@
         <w:drawing>
           <wp:inline xmlns:a="http://schemas.openxmlformats.org/drawingml/2006/main" xmlns:pic="http://schemas.openxmlformats.org/drawingml/2006/picture">
             <wp:extent cx="5486400" cy="2084832"/>
-            <wp:docPr id="9" name="Picture 9"/>
+            <wp:docPr id="10" name="Picture 10"/>
             <wp:cNvGraphicFramePr>
               <a:graphicFrameLocks noChangeAspect="1"/>
             </wp:cNvGraphicFramePr>
@@ -8641,7 +8681,7 @@
                     <pic:cNvPicPr/>
                   </pic:nvPicPr>
                   <pic:blipFill>
-                    <a:blip r:embed="rId17"/>
+                    <a:blip r:embed="rId18"/>
                     <a:stretch>
                       <a:fillRect/>
                     </a:stretch>
@@ -8681,7 +8721,7 @@
         <w:drawing>
           <wp:inline xmlns:a="http://schemas.openxmlformats.org/drawingml/2006/main" xmlns:pic="http://schemas.openxmlformats.org/drawingml/2006/picture">
             <wp:extent cx="5486400" cy="2761488"/>
-            <wp:docPr id="10" name="Picture 10"/>
+            <wp:docPr id="11" name="Picture 11"/>
             <wp:cNvGraphicFramePr>
               <a:graphicFrameLocks noChangeAspect="1"/>
             </wp:cNvGraphicFramePr>
@@ -8693,7 +8733,7 @@
                     <pic:cNvPicPr/>
                   </pic:nvPicPr>
                   <pic:blipFill>
-                    <a:blip r:embed="rId18"/>
+                    <a:blip r:embed="rId19"/>
                     <a:stretch>
                       <a:fillRect/>
                     </a:stretch>
@@ -8733,7 +8773,7 @@
         <w:drawing>
           <wp:inline xmlns:a="http://schemas.openxmlformats.org/drawingml/2006/main" xmlns:pic="http://schemas.openxmlformats.org/drawingml/2006/picture">
             <wp:extent cx="5486400" cy="3108960"/>
-            <wp:docPr id="11" name="Picture 11"/>
+            <wp:docPr id="12" name="Picture 12"/>
             <wp:cNvGraphicFramePr>
               <a:graphicFrameLocks noChangeAspect="1"/>
             </wp:cNvGraphicFramePr>
@@ -8745,7 +8785,7 @@
                     <pic:cNvPicPr/>
                   </pic:nvPicPr>
                   <pic:blipFill>
-                    <a:blip r:embed="rId19"/>
+                    <a:blip r:embed="rId20"/>
                     <a:stretch>
                       <a:fillRect/>
                     </a:stretch>
@@ -8785,7 +8825,7 @@
         <w:drawing>
           <wp:inline xmlns:a="http://schemas.openxmlformats.org/drawingml/2006/main" xmlns:pic="http://schemas.openxmlformats.org/drawingml/2006/picture">
             <wp:extent cx="5486400" cy="2871215"/>
-            <wp:docPr id="12" name="Picture 12"/>
+            <wp:docPr id="13" name="Picture 13"/>
             <wp:cNvGraphicFramePr>
               <a:graphicFrameLocks noChangeAspect="1"/>
             </wp:cNvGraphicFramePr>
@@ -8797,7 +8837,7 @@
                     <pic:cNvPicPr/>
                   </pic:nvPicPr>
                   <pic:blipFill>
-                    <a:blip r:embed="rId20"/>
+                    <a:blip r:embed="rId21"/>
                     <a:stretch>
                       <a:fillRect/>
                     </a:stretch>
@@ -8837,7 +8877,7 @@
         <w:drawing>
           <wp:inline xmlns:a="http://schemas.openxmlformats.org/drawingml/2006/main" xmlns:pic="http://schemas.openxmlformats.org/drawingml/2006/picture">
             <wp:extent cx="5486400" cy="3511296"/>
-            <wp:docPr id="13" name="Picture 13"/>
+            <wp:docPr id="14" name="Picture 14"/>
             <wp:cNvGraphicFramePr>
               <a:graphicFrameLocks noChangeAspect="1"/>
             </wp:cNvGraphicFramePr>
@@ -8849,7 +8889,7 @@
                     <pic:cNvPicPr/>
                   </pic:nvPicPr>
                   <pic:blipFill>
-                    <a:blip r:embed="rId21"/>
+                    <a:blip r:embed="rId22"/>
                     <a:stretch>
                       <a:fillRect/>
                     </a:stretch>
@@ -8889,7 +8929,7 @@
         <w:drawing>
           <wp:inline xmlns:a="http://schemas.openxmlformats.org/drawingml/2006/main" xmlns:pic="http://schemas.openxmlformats.org/drawingml/2006/picture">
             <wp:extent cx="5486400" cy="2615184"/>
-            <wp:docPr id="14" name="Picture 14"/>
+            <wp:docPr id="15" name="Picture 15"/>
             <wp:cNvGraphicFramePr>
               <a:graphicFrameLocks noChangeAspect="1"/>
             </wp:cNvGraphicFramePr>
@@ -8901,7 +8941,7 @@
                     <pic:cNvPicPr/>
                   </pic:nvPicPr>
                   <pic:blipFill>
-                    <a:blip r:embed="rId22"/>
+                    <a:blip r:embed="rId23"/>
                     <a:stretch>
                       <a:fillRect/>
                     </a:stretch>

</xml_diff>